<commit_message>
Añado en el word las soluciones de los ejercicios 6 y 7
</commit_message>
<xml_diff>
--- a/Metodologia/src/MethodReference/Ejercicios de Method Reference.docx
+++ b/Metodologia/src/MethodReference/Ejercicios de Method Reference.docx
@@ -1,17 +1,21 @@
 
 <file path=word/document.xml><?xml version="1.0" encoding="utf-8"?>
-<w:document xmlns:wpc="http://schemas.microsoft.com/office/word/2010/wordprocessingCanvas" xmlns:cx="http://schemas.microsoft.com/office/drawing/2014/chartex" xmlns:mc="http://schemas.openxmlformats.org/markup-compatibility/2006" xmlns:o="urn:schemas-microsoft-com:office:office" xmlns:r="http://schemas.openxmlformats.org/officeDocument/2006/relationships" xmlns:m="http://schemas.openxmlformats.org/officeDocument/2006/math" xmlns:v="urn:schemas-microsoft-com:vml" xmlns:wp14="http://schemas.microsoft.com/office/word/2010/wordprocessingDrawing" xmlns:wp="http://schemas.openxmlformats.org/drawingml/2006/wordprocessingDrawing" xmlns:w10="urn:schemas-microsoft-com:office:word" xmlns:w="http://schemas.openxmlformats.org/wordprocessingml/2006/main" xmlns:w14="http://schemas.microsoft.com/office/word/2010/wordml" xmlns:w15="http://schemas.microsoft.com/office/word/2012/wordml" xmlns:w16se="http://schemas.microsoft.com/office/word/2015/wordml/symex" xmlns:wpg="http://schemas.microsoft.com/office/word/2010/wordprocessingGroup" xmlns:wpi="http://schemas.microsoft.com/office/word/2010/wordprocessingInk" xmlns:wne="http://schemas.microsoft.com/office/word/2006/wordml" xmlns:wps="http://schemas.microsoft.com/office/word/2010/wordprocessingShape" mc:Ignorable="w14 w15 w16se wp14">
+<w:document xmlns:wpc="http://schemas.microsoft.com/office/word/2010/wordprocessingCanvas" xmlns:cx="http://schemas.microsoft.com/office/drawing/2014/chartex" xmlns:cx1="http://schemas.microsoft.com/office/drawing/2015/9/8/chartex" xmlns:cx2="http://schemas.microsoft.com/office/drawing/2015/10/21/chartex" xmlns:cx3="http://schemas.microsoft.com/office/drawing/2016/5/9/chartex" xmlns:cx4="http://schemas.microsoft.com/office/drawing/2016/5/10/chartex" xmlns:cx5="http://schemas.microsoft.com/office/drawing/2016/5/11/chartex" xmlns:cx6="http://schemas.microsoft.com/office/drawing/2016/5/12/chartex" xmlns:cx7="http://schemas.microsoft.com/office/drawing/2016/5/13/chartex" xmlns:cx8="http://schemas.microsoft.com/office/drawing/2016/5/14/chartex" xmlns:mc="http://schemas.openxmlformats.org/markup-compatibility/2006" xmlns:aink="http://schemas.microsoft.com/office/drawing/2016/ink" xmlns:am3d="http://schemas.microsoft.com/office/drawing/2017/model3d" xmlns:o="urn:schemas-microsoft-com:office:office" xmlns:oel="http://schemas.microsoft.com/office/2019/extlst" xmlns:r="http://schemas.openxmlformats.org/officeDocument/2006/relationships" xmlns:m="http://schemas.openxmlformats.org/officeDocument/2006/math" xmlns:v="urn:schemas-microsoft-com:vml" xmlns:wp14="http://schemas.microsoft.com/office/word/2010/wordprocessingDrawing" xmlns:wp="http://schemas.openxmlformats.org/drawingml/2006/wordprocessingDrawing" xmlns:w10="urn:schemas-microsoft-com:office:word" xmlns:w="http://schemas.openxmlformats.org/wordprocessingml/2006/main" xmlns:w14="http://schemas.microsoft.com/office/word/2010/wordml" xmlns:w15="http://schemas.microsoft.com/office/word/2012/wordml" xmlns:w16cex="http://schemas.microsoft.com/office/word/2018/wordml/cex" xmlns:w16cid="http://schemas.microsoft.com/office/word/2016/wordml/cid" xmlns:w16="http://schemas.microsoft.com/office/word/2018/wordml" xmlns:w16du="http://schemas.microsoft.com/office/word/2023/wordml/word16du" xmlns:w16sdtdh="http://schemas.microsoft.com/office/word/2020/wordml/sdtdatahash" xmlns:w16sdtfl="http://schemas.microsoft.com/office/word/2024/wordml/sdtformatlock" xmlns:w16se="http://schemas.microsoft.com/office/word/2015/wordml/symex" xmlns:wpg="http://schemas.microsoft.com/office/word/2010/wordprocessingGroup" xmlns:wpi="http://schemas.microsoft.com/office/word/2010/wordprocessingInk" xmlns:wne="http://schemas.microsoft.com/office/word/2006/wordml" xmlns:wps="http://schemas.microsoft.com/office/word/2010/wordprocessingShape" mc:Ignorable="w14 w15 w16se w16cid w16 w16cex w16sdtdh w16sdtfl w16du wp14">
   <w:body>
     <w:p>
       <w:pPr>
         <w:pStyle w:val="Ttulo3"/>
         <w:spacing w:before="281" w:after="281"/>
-      </w:pPr>
-      <w:r>
-        <w:rPr>
-          <w:rFonts w:ascii="Aptos" w:eastAsia="Aptos" w:hAnsi="Aptos" w:cs="Aptos"/>
-          <w:b/>
-          <w:bCs/>
+        <w:rPr>
+          <w:lang w:val="es-ES"/>
+        </w:rPr>
+      </w:pPr>
+      <w:r>
+        <w:rPr>
+          <w:rFonts w:ascii="Aptos" w:eastAsia="Aptos" w:hAnsi="Aptos" w:cs="Aptos"/>
+          <w:b/>
+          <w:bCs/>
+          <w:lang w:val="es-ES"/>
         </w:rPr>
         <w:t>1</w:t>
       </w:r>
@@ -20,31 +24,100 @@
           <w:rFonts w:ascii="Aptos" w:eastAsia="Aptos" w:hAnsi="Aptos" w:cs="Aptos"/>
           <w:b/>
           <w:bCs/>
-        </w:rPr>
-        <w:t>. De method reference a lambda</w:t>
+          <w:lang w:val="es-ES"/>
+        </w:rPr>
+        <w:t xml:space="preserve">. De </w:t>
+      </w:r>
+      <w:proofErr w:type="spellStart"/>
+      <w:r>
+        <w:rPr>
+          <w:rFonts w:ascii="Aptos" w:eastAsia="Aptos" w:hAnsi="Aptos" w:cs="Aptos"/>
+          <w:b/>
+          <w:bCs/>
+          <w:lang w:val="es-ES"/>
+        </w:rPr>
+        <w:t>method</w:t>
+      </w:r>
+      <w:proofErr w:type="spellEnd"/>
+      <w:r>
+        <w:rPr>
+          <w:rFonts w:ascii="Aptos" w:eastAsia="Aptos" w:hAnsi="Aptos" w:cs="Aptos"/>
+          <w:b/>
+          <w:bCs/>
+          <w:lang w:val="es-ES"/>
+        </w:rPr>
+        <w:t xml:space="preserve"> </w:t>
+      </w:r>
+      <w:proofErr w:type="spellStart"/>
+      <w:r>
+        <w:rPr>
+          <w:rFonts w:ascii="Aptos" w:eastAsia="Aptos" w:hAnsi="Aptos" w:cs="Aptos"/>
+          <w:b/>
+          <w:bCs/>
+          <w:lang w:val="es-ES"/>
+        </w:rPr>
+        <w:t>reference</w:t>
+      </w:r>
+      <w:proofErr w:type="spellEnd"/>
+      <w:r>
+        <w:rPr>
+          <w:rFonts w:ascii="Aptos" w:eastAsia="Aptos" w:hAnsi="Aptos" w:cs="Aptos"/>
+          <w:b/>
+          <w:bCs/>
+          <w:lang w:val="es-ES"/>
+        </w:rPr>
+        <w:t xml:space="preserve"> a lambda</w:t>
       </w:r>
     </w:p>
     <w:p>
       <w:pPr>
         <w:spacing w:before="240" w:after="240"/>
-      </w:pPr>
-      <w:r>
-        <w:rPr>
-          <w:rFonts w:ascii="Aptos" w:eastAsia="Aptos" w:hAnsi="Aptos" w:cs="Aptos"/>
+        <w:rPr>
+          <w:lang w:val="es-ES"/>
+        </w:rPr>
+      </w:pPr>
+      <w:r>
+        <w:rPr>
+          <w:rFonts w:ascii="Aptos" w:eastAsia="Aptos" w:hAnsi="Aptos" w:cs="Aptos"/>
+          <w:lang w:val="es-ES"/>
         </w:rPr>
         <w:t xml:space="preserve">Convierte el siguiente </w:t>
       </w:r>
-      <w:r>
-        <w:rPr>
-          <w:rFonts w:ascii="Aptos" w:eastAsia="Aptos" w:hAnsi="Aptos" w:cs="Aptos"/>
-          <w:b/>
-          <w:bCs/>
-        </w:rPr>
-        <w:t>method reference</w:t>
-      </w:r>
-      <w:r>
-        <w:rPr>
-          <w:rFonts w:ascii="Aptos" w:eastAsia="Aptos" w:hAnsi="Aptos" w:cs="Aptos"/>
+      <w:proofErr w:type="spellStart"/>
+      <w:r>
+        <w:rPr>
+          <w:rFonts w:ascii="Aptos" w:eastAsia="Aptos" w:hAnsi="Aptos" w:cs="Aptos"/>
+          <w:b/>
+          <w:bCs/>
+          <w:lang w:val="es-ES"/>
+        </w:rPr>
+        <w:t>method</w:t>
+      </w:r>
+      <w:proofErr w:type="spellEnd"/>
+      <w:r>
+        <w:rPr>
+          <w:rFonts w:ascii="Aptos" w:eastAsia="Aptos" w:hAnsi="Aptos" w:cs="Aptos"/>
+          <w:b/>
+          <w:bCs/>
+          <w:lang w:val="es-ES"/>
+        </w:rPr>
+        <w:t xml:space="preserve"> </w:t>
+      </w:r>
+      <w:proofErr w:type="spellStart"/>
+      <w:r>
+        <w:rPr>
+          <w:rFonts w:ascii="Aptos" w:eastAsia="Aptos" w:hAnsi="Aptos" w:cs="Aptos"/>
+          <w:b/>
+          <w:bCs/>
+          <w:lang w:val="es-ES"/>
+        </w:rPr>
+        <w:t>reference</w:t>
+      </w:r>
+      <w:proofErr w:type="spellEnd"/>
+      <w:r>
+        <w:rPr>
+          <w:rFonts w:ascii="Aptos" w:eastAsia="Aptos" w:hAnsi="Aptos" w:cs="Aptos"/>
+          <w:lang w:val="es-ES"/>
         </w:rPr>
         <w:t xml:space="preserve"> en una lambda equivalente:</w:t>
       </w:r>
@@ -54,7 +127,21 @@
         <w:rPr>
           <w:rFonts w:ascii="Consolas" w:eastAsia="Consolas" w:hAnsi="Consolas" w:cs="Consolas"/>
         </w:rPr>
-        <w:t xml:space="preserve">Function&lt;String, Integer&gt; convertir = </w:t>
+        <w:t xml:space="preserve">Function&lt;String, Integer&gt; </w:t>
+      </w:r>
+      <w:proofErr w:type="spellStart"/>
+      <w:r>
+        <w:rPr>
+          <w:rFonts w:ascii="Consolas" w:eastAsia="Consolas" w:hAnsi="Consolas" w:cs="Consolas"/>
+        </w:rPr>
+        <w:t>convertir</w:t>
+      </w:r>
+      <w:proofErr w:type="spellEnd"/>
+      <w:r>
+        <w:rPr>
+          <w:rFonts w:ascii="Consolas" w:eastAsia="Consolas" w:hAnsi="Consolas" w:cs="Consolas"/>
+        </w:rPr>
+        <w:t xml:space="preserve"> = </w:t>
       </w:r>
       <w:proofErr w:type="gramStart"/>
       <w:r>
@@ -79,94 +166,88 @@
           <w:color w:val="839496"/>
           <w:sz w:val="21"/>
           <w:szCs w:val="21"/>
-          <w:lang w:val="es-ES" w:eastAsia="es-ES"/>
-        </w:rPr>
-      </w:pPr>
-      <w:proofErr w:type="spellStart"/>
+          <w:lang w:eastAsia="es-ES"/>
+        </w:rPr>
+      </w:pPr>
       <w:r>
         <w:rPr>
           <w:rFonts w:ascii="Libertinus Mono" w:eastAsia="Times New Roman" w:hAnsi="Libertinus Mono" w:cs="Times New Roman"/>
           <w:color w:val="CB4B16"/>
           <w:sz w:val="21"/>
           <w:szCs w:val="21"/>
-          <w:lang w:val="es-ES" w:eastAsia="es-ES"/>
+          <w:lang w:eastAsia="es-ES"/>
         </w:rPr>
         <w:t>Function</w:t>
       </w:r>
-      <w:proofErr w:type="spellEnd"/>
       <w:r>
         <w:rPr>
           <w:rFonts w:ascii="Libertinus Mono" w:eastAsia="Times New Roman" w:hAnsi="Libertinus Mono" w:cs="Times New Roman"/>
           <w:color w:val="839496"/>
           <w:sz w:val="21"/>
           <w:szCs w:val="21"/>
-          <w:lang w:val="es-ES" w:eastAsia="es-ES"/>
+          <w:lang w:eastAsia="es-ES"/>
         </w:rPr>
         <w:t>&lt;</w:t>
       </w:r>
-      <w:proofErr w:type="spellStart"/>
       <w:r>
         <w:rPr>
           <w:rFonts w:ascii="Libertinus Mono" w:eastAsia="Times New Roman" w:hAnsi="Libertinus Mono" w:cs="Times New Roman"/>
           <w:color w:val="CB4B16"/>
           <w:sz w:val="21"/>
           <w:szCs w:val="21"/>
-          <w:lang w:val="es-ES" w:eastAsia="es-ES"/>
+          <w:lang w:eastAsia="es-ES"/>
         </w:rPr>
         <w:t>String</w:t>
       </w:r>
-      <w:proofErr w:type="spellEnd"/>
       <w:r>
         <w:rPr>
           <w:rFonts w:ascii="Libertinus Mono" w:eastAsia="Times New Roman" w:hAnsi="Libertinus Mono" w:cs="Times New Roman"/>
           <w:color w:val="839496"/>
           <w:sz w:val="21"/>
           <w:szCs w:val="21"/>
-          <w:lang w:val="es-ES" w:eastAsia="es-ES"/>
+          <w:lang w:eastAsia="es-ES"/>
         </w:rPr>
         <w:t xml:space="preserve">, </w:t>
       </w:r>
-      <w:proofErr w:type="spellStart"/>
       <w:r>
         <w:rPr>
           <w:rFonts w:ascii="Libertinus Mono" w:eastAsia="Times New Roman" w:hAnsi="Libertinus Mono" w:cs="Times New Roman"/>
           <w:color w:val="CB4B16"/>
           <w:sz w:val="21"/>
           <w:szCs w:val="21"/>
-          <w:lang w:val="es-ES" w:eastAsia="es-ES"/>
+          <w:lang w:eastAsia="es-ES"/>
         </w:rPr>
         <w:t>Integer</w:t>
       </w:r>
-      <w:proofErr w:type="spellEnd"/>
       <w:r>
         <w:rPr>
           <w:rFonts w:ascii="Libertinus Mono" w:eastAsia="Times New Roman" w:hAnsi="Libertinus Mono" w:cs="Times New Roman"/>
           <w:color w:val="839496"/>
           <w:sz w:val="21"/>
           <w:szCs w:val="21"/>
-          <w:lang w:val="es-ES" w:eastAsia="es-ES"/>
+          <w:lang w:eastAsia="es-ES"/>
         </w:rPr>
         <w:t xml:space="preserve">&gt; </w:t>
       </w:r>
+      <w:proofErr w:type="spellStart"/>
       <w:r>
         <w:rPr>
           <w:rFonts w:ascii="Libertinus Mono" w:eastAsia="Times New Roman" w:hAnsi="Libertinus Mono" w:cs="Times New Roman"/>
           <w:color w:val="268BD2"/>
           <w:sz w:val="21"/>
           <w:szCs w:val="21"/>
-          <w:lang w:val="es-ES" w:eastAsia="es-ES"/>
+          <w:lang w:eastAsia="es-ES"/>
         </w:rPr>
         <w:t>convertir</w:t>
       </w:r>
-      <w:bookmarkStart w:id="0" w:name="_GoBack"/>
-      <w:bookmarkEnd w:id="0"/>
+      <w:proofErr w:type="spellEnd"/>
       <w:r>
         <w:rPr>
           <w:rFonts w:ascii="Libertinus Mono" w:eastAsia="Times New Roman" w:hAnsi="Libertinus Mono" w:cs="Times New Roman"/>
           <w:color w:val="839496"/>
           <w:sz w:val="21"/>
           <w:szCs w:val="21"/>
-          <w:lang w:val="es-ES" w:eastAsia="es-ES"/>
+          <w:lang w:eastAsia="es-ES"/>
         </w:rPr>
         <w:t xml:space="preserve"> </w:t>
       </w:r>
@@ -176,7 +257,7 @@
           <w:color w:val="859900"/>
           <w:sz w:val="21"/>
           <w:szCs w:val="21"/>
-          <w:lang w:val="es-ES" w:eastAsia="es-ES"/>
+          <w:lang w:eastAsia="es-ES"/>
         </w:rPr>
         <w:t>=</w:t>
       </w:r>
@@ -186,9 +267,31 @@
           <w:color w:val="839496"/>
           <w:sz w:val="21"/>
           <w:szCs w:val="21"/>
-          <w:lang w:val="es-ES" w:eastAsia="es-ES"/>
-        </w:rPr>
-        <w:t xml:space="preserve"> i </w:t>
+          <w:lang w:eastAsia="es-ES"/>
+        </w:rPr>
+        <w:t xml:space="preserve"> </w:t>
+      </w:r>
+      <w:proofErr w:type="spellStart"/>
+      <w:r>
+        <w:rPr>
+          <w:rFonts w:ascii="Libertinus Mono" w:eastAsia="Times New Roman" w:hAnsi="Libertinus Mono" w:cs="Times New Roman"/>
+          <w:color w:val="839496"/>
+          <w:sz w:val="21"/>
+          <w:szCs w:val="21"/>
+          <w:lang w:eastAsia="es-ES"/>
+        </w:rPr>
+        <w:t>i</w:t>
+      </w:r>
+      <w:proofErr w:type="spellEnd"/>
+      <w:r>
+        <w:rPr>
+          <w:rFonts w:ascii="Libertinus Mono" w:eastAsia="Times New Roman" w:hAnsi="Libertinus Mono" w:cs="Times New Roman"/>
+          <w:color w:val="839496"/>
+          <w:sz w:val="21"/>
+          <w:szCs w:val="21"/>
+          <w:lang w:eastAsia="es-ES"/>
+        </w:rPr>
+        <w:t xml:space="preserve"> </w:t>
       </w:r>
       <w:r>
         <w:rPr>
@@ -198,7 +301,7 @@
           <w:color w:val="93A1A1"/>
           <w:sz w:val="21"/>
           <w:szCs w:val="21"/>
-          <w:lang w:val="es-ES" w:eastAsia="es-ES"/>
+          <w:lang w:eastAsia="es-ES"/>
         </w:rPr>
         <w:t>-&gt;</w:t>
       </w:r>
@@ -208,7 +311,7 @@
           <w:color w:val="839496"/>
           <w:sz w:val="21"/>
           <w:szCs w:val="21"/>
-          <w:lang w:val="es-ES" w:eastAsia="es-ES"/>
+          <w:lang w:eastAsia="es-ES"/>
         </w:rPr>
         <w:t xml:space="preserve"> </w:t>
       </w:r>
@@ -219,7 +322,7 @@
           <w:color w:val="CB4B16"/>
           <w:sz w:val="21"/>
           <w:szCs w:val="21"/>
-          <w:lang w:val="es-ES" w:eastAsia="es-ES"/>
+          <w:lang w:eastAsia="es-ES"/>
         </w:rPr>
         <w:t>Integer</w:t>
       </w:r>
@@ -229,7 +332,7 @@
           <w:color w:val="839496"/>
           <w:sz w:val="21"/>
           <w:szCs w:val="21"/>
-          <w:lang w:val="es-ES" w:eastAsia="es-ES"/>
+          <w:lang w:eastAsia="es-ES"/>
         </w:rPr>
         <w:t>.</w:t>
       </w:r>
@@ -239,7 +342,7 @@
           <w:color w:val="268BD2"/>
           <w:sz w:val="21"/>
           <w:szCs w:val="21"/>
-          <w:lang w:val="es-ES" w:eastAsia="es-ES"/>
+          <w:lang w:eastAsia="es-ES"/>
         </w:rPr>
         <w:t>parseInt</w:t>
       </w:r>
@@ -250,9 +353,31 @@
           <w:color w:val="839496"/>
           <w:sz w:val="21"/>
           <w:szCs w:val="21"/>
-          <w:lang w:val="es-ES" w:eastAsia="es-ES"/>
-        </w:rPr>
-        <w:t>(i);</w:t>
+          <w:lang w:eastAsia="es-ES"/>
+        </w:rPr>
+        <w:t>(</w:t>
+      </w:r>
+      <w:proofErr w:type="spellStart"/>
+      <w:r>
+        <w:rPr>
+          <w:rFonts w:ascii="Libertinus Mono" w:eastAsia="Times New Roman" w:hAnsi="Libertinus Mono" w:cs="Times New Roman"/>
+          <w:color w:val="839496"/>
+          <w:sz w:val="21"/>
+          <w:szCs w:val="21"/>
+          <w:lang w:eastAsia="es-ES"/>
+        </w:rPr>
+        <w:t>i</w:t>
+      </w:r>
+      <w:proofErr w:type="spellEnd"/>
+      <w:r>
+        <w:rPr>
+          <w:rFonts w:ascii="Libertinus Mono" w:eastAsia="Times New Roman" w:hAnsi="Libertinus Mono" w:cs="Times New Roman"/>
+          <w:color w:val="839496"/>
+          <w:sz w:val="21"/>
+          <w:szCs w:val="21"/>
+          <w:lang w:eastAsia="es-ES"/>
+        </w:rPr>
+        <w:t>);</w:t>
       </w:r>
     </w:p>
     <w:p>
@@ -263,7 +388,7 @@
           <w:color w:val="839496"/>
           <w:sz w:val="21"/>
           <w:szCs w:val="21"/>
-          <w:lang w:val="es-ES" w:eastAsia="es-ES"/>
+          <w:lang w:eastAsia="es-ES"/>
         </w:rPr>
       </w:pPr>
     </w:p>
@@ -272,12 +397,16 @@
       <w:pPr>
         <w:pStyle w:val="Ttulo3"/>
         <w:spacing w:before="281" w:after="281"/>
-      </w:pPr>
-      <w:r>
-        <w:rPr>
-          <w:rFonts w:ascii="Aptos" w:eastAsia="Aptos" w:hAnsi="Aptos" w:cs="Aptos"/>
-          <w:b/>
-          <w:bCs/>
+        <w:rPr>
+          <w:lang w:val="es-ES"/>
+        </w:rPr>
+      </w:pPr>
+      <w:r>
+        <w:rPr>
+          <w:rFonts w:ascii="Aptos" w:eastAsia="Aptos" w:hAnsi="Aptos" w:cs="Aptos"/>
+          <w:b/>
+          <w:bCs/>
+          <w:lang w:val="es-ES"/>
         </w:rPr>
         <w:t>2</w:t>
       </w:r>
@@ -286,17 +415,53 @@
           <w:rFonts w:ascii="Aptos" w:eastAsia="Aptos" w:hAnsi="Aptos" w:cs="Aptos"/>
           <w:b/>
           <w:bCs/>
-        </w:rPr>
-        <w:t>. De lambda a method reference</w:t>
-      </w:r>
+          <w:lang w:val="es-ES"/>
+        </w:rPr>
+        <w:t xml:space="preserve">. De lambda a </w:t>
+      </w:r>
+      <w:proofErr w:type="spellStart"/>
+      <w:r>
+        <w:rPr>
+          <w:rFonts w:ascii="Aptos" w:eastAsia="Aptos" w:hAnsi="Aptos" w:cs="Aptos"/>
+          <w:b/>
+          <w:bCs/>
+          <w:lang w:val="es-ES"/>
+        </w:rPr>
+        <w:t>method</w:t>
+      </w:r>
+      <w:proofErr w:type="spellEnd"/>
+      <w:r>
+        <w:rPr>
+          <w:rFonts w:ascii="Aptos" w:eastAsia="Aptos" w:hAnsi="Aptos" w:cs="Aptos"/>
+          <w:b/>
+          <w:bCs/>
+          <w:lang w:val="es-ES"/>
+        </w:rPr>
+        <w:t xml:space="preserve"> </w:t>
+      </w:r>
+      <w:proofErr w:type="spellStart"/>
+      <w:r>
+        <w:rPr>
+          <w:rFonts w:ascii="Aptos" w:eastAsia="Aptos" w:hAnsi="Aptos" w:cs="Aptos"/>
+          <w:b/>
+          <w:bCs/>
+          <w:lang w:val="es-ES"/>
+        </w:rPr>
+        <w:t>reference</w:t>
+      </w:r>
+      <w:proofErr w:type="spellEnd"/>
     </w:p>
     <w:p>
       <w:pPr>
         <w:spacing w:before="240" w:after="240"/>
-      </w:pPr>
-      <w:r>
-        <w:rPr>
-          <w:rFonts w:ascii="Aptos" w:eastAsia="Aptos" w:hAnsi="Aptos" w:cs="Aptos"/>
+        <w:rPr>
+          <w:lang w:val="es-ES"/>
+        </w:rPr>
+      </w:pPr>
+      <w:r>
+        <w:rPr>
+          <w:rFonts w:ascii="Aptos" w:eastAsia="Aptos" w:hAnsi="Aptos" w:cs="Aptos"/>
+          <w:lang w:val="es-ES"/>
         </w:rPr>
         <w:t>Convierte la siguiente lambda:</w:t>
       </w:r>
@@ -306,7 +471,21 @@
         <w:rPr>
           <w:rFonts w:ascii="Consolas" w:eastAsia="Consolas" w:hAnsi="Consolas" w:cs="Consolas"/>
         </w:rPr>
-        <w:t>Function&lt;String, String&gt; mayusculas =</w:t>
+        <w:t xml:space="preserve">Function&lt;String, String&gt; </w:t>
+      </w:r>
+      <w:proofErr w:type="spellStart"/>
+      <w:r>
+        <w:rPr>
+          <w:rFonts w:ascii="Consolas" w:eastAsia="Consolas" w:hAnsi="Consolas" w:cs="Consolas"/>
+        </w:rPr>
+        <w:t>mayusculas</w:t>
+      </w:r>
+      <w:proofErr w:type="spellEnd"/>
+      <w:r>
+        <w:rPr>
+          <w:rFonts w:ascii="Consolas" w:eastAsia="Consolas" w:hAnsi="Consolas" w:cs="Consolas"/>
+        </w:rPr>
+        <w:t xml:space="preserve"> =</w:t>
       </w:r>
       <w:r>
         <w:br/>
@@ -315,7 +494,21 @@
         <w:rPr>
           <w:rFonts w:ascii="Consolas" w:eastAsia="Consolas" w:hAnsi="Consolas" w:cs="Consolas"/>
         </w:rPr>
-        <w:t xml:space="preserve">        texto -&gt; texto.toUpperCase();</w:t>
+        <w:t xml:space="preserve">        texto -&gt; </w:t>
+      </w:r>
+      <w:proofErr w:type="gramStart"/>
+      <w:r>
+        <w:rPr>
+          <w:rFonts w:ascii="Consolas" w:eastAsia="Consolas" w:hAnsi="Consolas" w:cs="Consolas"/>
+        </w:rPr>
+        <w:t>texto.toUpperCase</w:t>
+      </w:r>
+      <w:proofErr w:type="gramEnd"/>
+      <w:r>
+        <w:rPr>
+          <w:rFonts w:ascii="Consolas" w:eastAsia="Consolas" w:hAnsi="Consolas" w:cs="Consolas"/>
+        </w:rPr>
+        <w:t>();</w:t>
       </w:r>
     </w:p>
     <w:p>
@@ -326,72 +519,66 @@
           <w:color w:val="839496"/>
           <w:sz w:val="21"/>
           <w:szCs w:val="21"/>
-          <w:lang w:val="es-ES" w:eastAsia="es-ES"/>
-        </w:rPr>
-      </w:pPr>
-      <w:proofErr w:type="spellStart"/>
+          <w:lang w:eastAsia="es-ES"/>
+        </w:rPr>
+      </w:pPr>
       <w:r>
         <w:rPr>
           <w:rFonts w:ascii="Libertinus Mono" w:eastAsia="Times New Roman" w:hAnsi="Libertinus Mono" w:cs="Times New Roman"/>
           <w:color w:val="CB4B16"/>
           <w:sz w:val="21"/>
           <w:szCs w:val="21"/>
-          <w:lang w:val="es-ES" w:eastAsia="es-ES"/>
+          <w:lang w:eastAsia="es-ES"/>
         </w:rPr>
         <w:t>Function</w:t>
       </w:r>
-      <w:proofErr w:type="spellEnd"/>
       <w:r>
         <w:rPr>
           <w:rFonts w:ascii="Libertinus Mono" w:eastAsia="Times New Roman" w:hAnsi="Libertinus Mono" w:cs="Times New Roman"/>
           <w:color w:val="839496"/>
           <w:sz w:val="21"/>
           <w:szCs w:val="21"/>
-          <w:lang w:val="es-ES" w:eastAsia="es-ES"/>
+          <w:lang w:eastAsia="es-ES"/>
         </w:rPr>
         <w:t>&lt;</w:t>
       </w:r>
-      <w:proofErr w:type="spellStart"/>
       <w:r>
         <w:rPr>
           <w:rFonts w:ascii="Libertinus Mono" w:eastAsia="Times New Roman" w:hAnsi="Libertinus Mono" w:cs="Times New Roman"/>
           <w:color w:val="CB4B16"/>
           <w:sz w:val="21"/>
           <w:szCs w:val="21"/>
-          <w:lang w:val="es-ES" w:eastAsia="es-ES"/>
+          <w:lang w:eastAsia="es-ES"/>
         </w:rPr>
         <w:t>String</w:t>
       </w:r>
-      <w:proofErr w:type="spellEnd"/>
       <w:r>
         <w:rPr>
           <w:rFonts w:ascii="Libertinus Mono" w:eastAsia="Times New Roman" w:hAnsi="Libertinus Mono" w:cs="Times New Roman"/>
           <w:color w:val="839496"/>
           <w:sz w:val="21"/>
           <w:szCs w:val="21"/>
-          <w:lang w:val="es-ES" w:eastAsia="es-ES"/>
+          <w:lang w:eastAsia="es-ES"/>
         </w:rPr>
         <w:t xml:space="preserve">, </w:t>
       </w:r>
-      <w:proofErr w:type="spellStart"/>
       <w:r>
         <w:rPr>
           <w:rFonts w:ascii="Libertinus Mono" w:eastAsia="Times New Roman" w:hAnsi="Libertinus Mono" w:cs="Times New Roman"/>
           <w:color w:val="CB4B16"/>
           <w:sz w:val="21"/>
           <w:szCs w:val="21"/>
-          <w:lang w:val="es-ES" w:eastAsia="es-ES"/>
+          <w:lang w:eastAsia="es-ES"/>
         </w:rPr>
         <w:t>String</w:t>
       </w:r>
-      <w:proofErr w:type="spellEnd"/>
       <w:r>
         <w:rPr>
           <w:rFonts w:ascii="Libertinus Mono" w:eastAsia="Times New Roman" w:hAnsi="Libertinus Mono" w:cs="Times New Roman"/>
           <w:color w:val="839496"/>
           <w:sz w:val="21"/>
           <w:szCs w:val="21"/>
-          <w:lang w:val="es-ES" w:eastAsia="es-ES"/>
+          <w:lang w:eastAsia="es-ES"/>
         </w:rPr>
         <w:t xml:space="preserve">&gt; </w:t>
       </w:r>
@@ -402,7 +589,7 @@
           <w:color w:val="268BD2"/>
           <w:sz w:val="21"/>
           <w:szCs w:val="21"/>
-          <w:lang w:val="es-ES" w:eastAsia="es-ES"/>
+          <w:lang w:eastAsia="es-ES"/>
         </w:rPr>
         <w:t>mayusculas</w:t>
       </w:r>
@@ -413,7 +600,7 @@
           <w:color w:val="839496"/>
           <w:sz w:val="21"/>
           <w:szCs w:val="21"/>
-          <w:lang w:val="es-ES" w:eastAsia="es-ES"/>
+          <w:lang w:eastAsia="es-ES"/>
         </w:rPr>
         <w:t xml:space="preserve"> </w:t>
       </w:r>
@@ -423,7 +610,7 @@
           <w:color w:val="859900"/>
           <w:sz w:val="21"/>
           <w:szCs w:val="21"/>
-          <w:lang w:val="es-ES" w:eastAsia="es-ES"/>
+          <w:lang w:eastAsia="es-ES"/>
         </w:rPr>
         <w:t>=</w:t>
       </w:r>
@@ -433,11 +620,10 @@
           <w:color w:val="839496"/>
           <w:sz w:val="21"/>
           <w:szCs w:val="21"/>
-          <w:lang w:val="es-ES" w:eastAsia="es-ES"/>
+          <w:lang w:eastAsia="es-ES"/>
         </w:rPr>
         <w:t xml:space="preserve"> </w:t>
       </w:r>
-      <w:proofErr w:type="spellStart"/>
       <w:proofErr w:type="gramStart"/>
       <w:r>
         <w:rPr>
@@ -445,18 +631,17 @@
           <w:color w:val="CB4B16"/>
           <w:sz w:val="21"/>
           <w:szCs w:val="21"/>
-          <w:lang w:val="es-ES" w:eastAsia="es-ES"/>
+          <w:lang w:eastAsia="es-ES"/>
         </w:rPr>
         <w:t>String</w:t>
       </w:r>
-      <w:proofErr w:type="spellEnd"/>
       <w:r>
         <w:rPr>
           <w:rFonts w:ascii="Libertinus Mono" w:eastAsia="Times New Roman" w:hAnsi="Libertinus Mono" w:cs="Times New Roman"/>
           <w:color w:val="859900"/>
           <w:sz w:val="21"/>
           <w:szCs w:val="21"/>
-          <w:lang w:val="es-ES" w:eastAsia="es-ES"/>
+          <w:lang w:eastAsia="es-ES"/>
         </w:rPr>
         <w:t>::</w:t>
       </w:r>
@@ -468,7 +653,7 @@
           <w:color w:val="268BD2"/>
           <w:sz w:val="21"/>
           <w:szCs w:val="21"/>
-          <w:lang w:val="es-ES" w:eastAsia="es-ES"/>
+          <w:lang w:eastAsia="es-ES"/>
         </w:rPr>
         <w:t>toUpperCase</w:t>
       </w:r>
@@ -479,7 +664,7 @@
           <w:color w:val="839496"/>
           <w:sz w:val="21"/>
           <w:szCs w:val="21"/>
-          <w:lang w:val="es-ES" w:eastAsia="es-ES"/>
+          <w:lang w:eastAsia="es-ES"/>
         </w:rPr>
         <w:t>;</w:t>
       </w:r>
@@ -492,7 +677,7 @@
           <w:color w:val="839496"/>
           <w:sz w:val="21"/>
           <w:szCs w:val="21"/>
-          <w:lang w:val="es-ES" w:eastAsia="es-ES"/>
+          <w:lang w:eastAsia="es-ES"/>
         </w:rPr>
       </w:pPr>
     </w:p>
@@ -501,12 +686,16 @@
       <w:pPr>
         <w:pStyle w:val="Ttulo3"/>
         <w:spacing w:before="281" w:after="281"/>
-      </w:pPr>
-      <w:r>
-        <w:rPr>
-          <w:rFonts w:ascii="Aptos" w:eastAsia="Aptos" w:hAnsi="Aptos" w:cs="Aptos"/>
-          <w:b/>
-          <w:bCs/>
+        <w:rPr>
+          <w:lang w:val="es-ES"/>
+        </w:rPr>
+      </w:pPr>
+      <w:r>
+        <w:rPr>
+          <w:rFonts w:ascii="Aptos" w:eastAsia="Aptos" w:hAnsi="Aptos" w:cs="Aptos"/>
+          <w:b/>
+          <w:bCs/>
+          <w:lang w:val="es-ES"/>
         </w:rPr>
         <w:t>3</w:t>
       </w:r>
@@ -515,31 +704,100 @@
           <w:rFonts w:ascii="Aptos" w:eastAsia="Aptos" w:hAnsi="Aptos" w:cs="Aptos"/>
           <w:b/>
           <w:bCs/>
-        </w:rPr>
-        <w:t>. De method reference a lambda</w:t>
+          <w:lang w:val="es-ES"/>
+        </w:rPr>
+        <w:t xml:space="preserve">. De </w:t>
+      </w:r>
+      <w:proofErr w:type="spellStart"/>
+      <w:r>
+        <w:rPr>
+          <w:rFonts w:ascii="Aptos" w:eastAsia="Aptos" w:hAnsi="Aptos" w:cs="Aptos"/>
+          <w:b/>
+          <w:bCs/>
+          <w:lang w:val="es-ES"/>
+        </w:rPr>
+        <w:t>method</w:t>
+      </w:r>
+      <w:proofErr w:type="spellEnd"/>
+      <w:r>
+        <w:rPr>
+          <w:rFonts w:ascii="Aptos" w:eastAsia="Aptos" w:hAnsi="Aptos" w:cs="Aptos"/>
+          <w:b/>
+          <w:bCs/>
+          <w:lang w:val="es-ES"/>
+        </w:rPr>
+        <w:t xml:space="preserve"> </w:t>
+      </w:r>
+      <w:proofErr w:type="spellStart"/>
+      <w:r>
+        <w:rPr>
+          <w:rFonts w:ascii="Aptos" w:eastAsia="Aptos" w:hAnsi="Aptos" w:cs="Aptos"/>
+          <w:b/>
+          <w:bCs/>
+          <w:lang w:val="es-ES"/>
+        </w:rPr>
+        <w:t>reference</w:t>
+      </w:r>
+      <w:proofErr w:type="spellEnd"/>
+      <w:r>
+        <w:rPr>
+          <w:rFonts w:ascii="Aptos" w:eastAsia="Aptos" w:hAnsi="Aptos" w:cs="Aptos"/>
+          <w:b/>
+          <w:bCs/>
+          <w:lang w:val="es-ES"/>
+        </w:rPr>
+        <w:t xml:space="preserve"> a lambda</w:t>
       </w:r>
     </w:p>
     <w:p>
       <w:pPr>
         <w:spacing w:before="240" w:after="240"/>
-      </w:pPr>
-      <w:r>
-        <w:rPr>
-          <w:rFonts w:ascii="Aptos" w:eastAsia="Aptos" w:hAnsi="Aptos" w:cs="Aptos"/>
+        <w:rPr>
+          <w:lang w:val="es-ES"/>
+        </w:rPr>
+      </w:pPr>
+      <w:r>
+        <w:rPr>
+          <w:rFonts w:ascii="Aptos" w:eastAsia="Aptos" w:hAnsi="Aptos" w:cs="Aptos"/>
+          <w:lang w:val="es-ES"/>
         </w:rPr>
         <w:t xml:space="preserve">Convierte el siguiente </w:t>
       </w:r>
-      <w:r>
-        <w:rPr>
-          <w:rFonts w:ascii="Aptos" w:eastAsia="Aptos" w:hAnsi="Aptos" w:cs="Aptos"/>
-          <w:b/>
-          <w:bCs/>
-        </w:rPr>
-        <w:t>method reference</w:t>
-      </w:r>
-      <w:r>
-        <w:rPr>
-          <w:rFonts w:ascii="Aptos" w:eastAsia="Aptos" w:hAnsi="Aptos" w:cs="Aptos"/>
+      <w:proofErr w:type="spellStart"/>
+      <w:r>
+        <w:rPr>
+          <w:rFonts w:ascii="Aptos" w:eastAsia="Aptos" w:hAnsi="Aptos" w:cs="Aptos"/>
+          <w:b/>
+          <w:bCs/>
+          <w:lang w:val="es-ES"/>
+        </w:rPr>
+        <w:t>method</w:t>
+      </w:r>
+      <w:proofErr w:type="spellEnd"/>
+      <w:r>
+        <w:rPr>
+          <w:rFonts w:ascii="Aptos" w:eastAsia="Aptos" w:hAnsi="Aptos" w:cs="Aptos"/>
+          <w:b/>
+          <w:bCs/>
+          <w:lang w:val="es-ES"/>
+        </w:rPr>
+        <w:t xml:space="preserve"> </w:t>
+      </w:r>
+      <w:proofErr w:type="spellStart"/>
+      <w:r>
+        <w:rPr>
+          <w:rFonts w:ascii="Aptos" w:eastAsia="Aptos" w:hAnsi="Aptos" w:cs="Aptos"/>
+          <w:b/>
+          <w:bCs/>
+          <w:lang w:val="es-ES"/>
+        </w:rPr>
+        <w:t>reference</w:t>
+      </w:r>
+      <w:proofErr w:type="spellEnd"/>
+      <w:r>
+        <w:rPr>
+          <w:rFonts w:ascii="Aptos" w:eastAsia="Aptos" w:hAnsi="Aptos" w:cs="Aptos"/>
+          <w:lang w:val="es-ES"/>
         </w:rPr>
         <w:t xml:space="preserve"> en una lambda:</w:t>
       </w:r>
@@ -549,21 +807,51 @@
         <w:rPr>
           <w:rFonts w:ascii="Consolas" w:eastAsia="Consolas" w:hAnsi="Consolas" w:cs="Consolas"/>
         </w:rPr>
-        <w:t xml:space="preserve">Consumer&lt;String&gt; imprimir = </w:t>
-      </w:r>
+        <w:t xml:space="preserve">Consumer&lt;String&gt; </w:t>
+      </w:r>
+      <w:proofErr w:type="spellStart"/>
+      <w:r>
+        <w:rPr>
+          <w:rFonts w:ascii="Consolas" w:eastAsia="Consolas" w:hAnsi="Consolas" w:cs="Consolas"/>
+        </w:rPr>
+        <w:t>imprimir</w:t>
+      </w:r>
+      <w:proofErr w:type="spellEnd"/>
+      <w:r>
+        <w:rPr>
+          <w:rFonts w:ascii="Consolas" w:eastAsia="Consolas" w:hAnsi="Consolas" w:cs="Consolas"/>
+        </w:rPr>
+        <w:t xml:space="preserve"> = </w:t>
+      </w:r>
+      <w:proofErr w:type="spellStart"/>
       <w:proofErr w:type="gramStart"/>
       <w:r>
         <w:rPr>
           <w:rFonts w:ascii="Consolas" w:eastAsia="Consolas" w:hAnsi="Consolas" w:cs="Consolas"/>
         </w:rPr>
-        <w:t>System.out::</w:t>
-      </w:r>
+        <w:t>System.out</w:t>
+      </w:r>
+      <w:proofErr w:type="spellEnd"/>
+      <w:r>
+        <w:rPr>
+          <w:rFonts w:ascii="Consolas" w:eastAsia="Consolas" w:hAnsi="Consolas" w:cs="Consolas"/>
+        </w:rPr>
+        <w:t>::</w:t>
+      </w:r>
+      <w:proofErr w:type="spellStart"/>
       <w:proofErr w:type="gramEnd"/>
       <w:r>
         <w:rPr>
           <w:rFonts w:ascii="Consolas" w:eastAsia="Consolas" w:hAnsi="Consolas" w:cs="Consolas"/>
         </w:rPr>
-        <w:t>println;</w:t>
+        <w:t>println</w:t>
+      </w:r>
+      <w:proofErr w:type="spellEnd"/>
+      <w:r>
+        <w:rPr>
+          <w:rFonts w:ascii="Consolas" w:eastAsia="Consolas" w:hAnsi="Consolas" w:cs="Consolas"/>
+        </w:rPr>
+        <w:t>;</w:t>
       </w:r>
     </w:p>
     <w:p>
@@ -574,70 +862,68 @@
           <w:color w:val="839496"/>
           <w:sz w:val="21"/>
           <w:szCs w:val="21"/>
-          <w:lang w:val="es-ES" w:eastAsia="es-ES"/>
-        </w:rPr>
-      </w:pPr>
-      <w:proofErr w:type="spellStart"/>
+          <w:lang w:eastAsia="es-ES"/>
+        </w:rPr>
+      </w:pPr>
       <w:r>
         <w:rPr>
           <w:rFonts w:ascii="Libertinus Mono" w:eastAsia="Times New Roman" w:hAnsi="Libertinus Mono" w:cs="Times New Roman"/>
           <w:color w:val="CB4B16"/>
           <w:sz w:val="21"/>
           <w:szCs w:val="21"/>
-          <w:lang w:val="es-ES" w:eastAsia="es-ES"/>
+          <w:lang w:eastAsia="es-ES"/>
         </w:rPr>
         <w:t>Consumer</w:t>
       </w:r>
-      <w:proofErr w:type="spellEnd"/>
       <w:r>
         <w:rPr>
           <w:rFonts w:ascii="Libertinus Mono" w:eastAsia="Times New Roman" w:hAnsi="Libertinus Mono" w:cs="Times New Roman"/>
           <w:color w:val="839496"/>
           <w:sz w:val="21"/>
           <w:szCs w:val="21"/>
-          <w:lang w:val="es-ES" w:eastAsia="es-ES"/>
+          <w:lang w:eastAsia="es-ES"/>
         </w:rPr>
         <w:t>&lt;</w:t>
       </w:r>
-      <w:proofErr w:type="spellStart"/>
       <w:r>
         <w:rPr>
           <w:rFonts w:ascii="Libertinus Mono" w:eastAsia="Times New Roman" w:hAnsi="Libertinus Mono" w:cs="Times New Roman"/>
           <w:color w:val="CB4B16"/>
           <w:sz w:val="21"/>
           <w:szCs w:val="21"/>
-          <w:lang w:val="es-ES" w:eastAsia="es-ES"/>
+          <w:lang w:eastAsia="es-ES"/>
         </w:rPr>
         <w:t>String</w:t>
       </w:r>
-      <w:proofErr w:type="spellEnd"/>
       <w:r>
         <w:rPr>
           <w:rFonts w:ascii="Libertinus Mono" w:eastAsia="Times New Roman" w:hAnsi="Libertinus Mono" w:cs="Times New Roman"/>
           <w:color w:val="839496"/>
           <w:sz w:val="21"/>
           <w:szCs w:val="21"/>
-          <w:lang w:val="es-ES" w:eastAsia="es-ES"/>
+          <w:lang w:eastAsia="es-ES"/>
         </w:rPr>
         <w:t xml:space="preserve">&gt; </w:t>
       </w:r>
+      <w:proofErr w:type="spellStart"/>
       <w:r>
         <w:rPr>
           <w:rFonts w:ascii="Libertinus Mono" w:eastAsia="Times New Roman" w:hAnsi="Libertinus Mono" w:cs="Times New Roman"/>
           <w:color w:val="268BD2"/>
           <w:sz w:val="21"/>
           <w:szCs w:val="21"/>
-          <w:lang w:val="es-ES" w:eastAsia="es-ES"/>
+          <w:lang w:eastAsia="es-ES"/>
         </w:rPr>
         <w:t>imprimir</w:t>
       </w:r>
+      <w:proofErr w:type="spellEnd"/>
       <w:r>
         <w:rPr>
           <w:rFonts w:ascii="Libertinus Mono" w:eastAsia="Times New Roman" w:hAnsi="Libertinus Mono" w:cs="Times New Roman"/>
           <w:color w:val="839496"/>
           <w:sz w:val="21"/>
           <w:szCs w:val="21"/>
-          <w:lang w:val="es-ES" w:eastAsia="es-ES"/>
+          <w:lang w:eastAsia="es-ES"/>
         </w:rPr>
         <w:t xml:space="preserve"> </w:t>
       </w:r>
@@ -647,7 +933,7 @@
           <w:color w:val="859900"/>
           <w:sz w:val="21"/>
           <w:szCs w:val="21"/>
-          <w:lang w:val="es-ES" w:eastAsia="es-ES"/>
+          <w:lang w:eastAsia="es-ES"/>
         </w:rPr>
         <w:t>=</w:t>
       </w:r>
@@ -657,7 +943,29 @@
           <w:color w:val="839496"/>
           <w:sz w:val="21"/>
           <w:szCs w:val="21"/>
-          <w:lang w:val="es-ES" w:eastAsia="es-ES"/>
+          <w:lang w:eastAsia="es-ES"/>
+        </w:rPr>
+        <w:t xml:space="preserve"> str </w:t>
+      </w:r>
+      <w:r>
+        <w:rPr>
+          <w:rFonts w:ascii="Libertinus Mono" w:eastAsia="Times New Roman" w:hAnsi="Libertinus Mono" w:cs="Times New Roman"/>
+          <w:b/>
+          <w:bCs/>
+          <w:color w:val="93A1A1"/>
+          <w:sz w:val="21"/>
+          <w:szCs w:val="21"/>
+          <w:lang w:eastAsia="es-ES"/>
+        </w:rPr>
+        <w:t>-&gt;</w:t>
+      </w:r>
+      <w:r>
+        <w:rPr>
+          <w:rFonts w:ascii="Libertinus Mono" w:eastAsia="Times New Roman" w:hAnsi="Libertinus Mono" w:cs="Times New Roman"/>
+          <w:color w:val="839496"/>
+          <w:sz w:val="21"/>
+          <w:szCs w:val="21"/>
+          <w:lang w:eastAsia="es-ES"/>
         </w:rPr>
         <w:t xml:space="preserve"> </w:t>
       </w:r>
@@ -665,129 +973,63 @@
       <w:r>
         <w:rPr>
           <w:rFonts w:ascii="Libertinus Mono" w:eastAsia="Times New Roman" w:hAnsi="Libertinus Mono" w:cs="Times New Roman"/>
+          <w:color w:val="CB4B16"/>
+          <w:sz w:val="21"/>
+          <w:szCs w:val="21"/>
+          <w:lang w:eastAsia="es-ES"/>
+        </w:rPr>
+        <w:t>System</w:t>
+      </w:r>
+      <w:r>
+        <w:rPr>
+          <w:rFonts w:ascii="Libertinus Mono" w:eastAsia="Times New Roman" w:hAnsi="Libertinus Mono" w:cs="Times New Roman"/>
           <w:color w:val="839496"/>
           <w:sz w:val="21"/>
           <w:szCs w:val="21"/>
-          <w:lang w:val="es-ES" w:eastAsia="es-ES"/>
-        </w:rPr>
-        <w:t>str</w:t>
-      </w:r>
-      <w:proofErr w:type="spellEnd"/>
+          <w:lang w:eastAsia="es-ES"/>
+        </w:rPr>
+        <w:t>.</w:t>
+      </w:r>
+      <w:r>
+        <w:rPr>
+          <w:rFonts w:ascii="Libertinus Mono" w:eastAsia="Times New Roman" w:hAnsi="Libertinus Mono" w:cs="Times New Roman"/>
+          <w:color w:val="268BD2"/>
+          <w:sz w:val="21"/>
+          <w:szCs w:val="21"/>
+          <w:lang w:eastAsia="es-ES"/>
+        </w:rPr>
+        <w:t>out</w:t>
+      </w:r>
       <w:r>
         <w:rPr>
           <w:rFonts w:ascii="Libertinus Mono" w:eastAsia="Times New Roman" w:hAnsi="Libertinus Mono" w:cs="Times New Roman"/>
           <w:color w:val="839496"/>
           <w:sz w:val="21"/>
           <w:szCs w:val="21"/>
-          <w:lang w:val="es-ES" w:eastAsia="es-ES"/>
-        </w:rPr>
-        <w:t xml:space="preserve"> </w:t>
-      </w:r>
-      <w:r>
-        <w:rPr>
-          <w:rFonts w:ascii="Libertinus Mono" w:eastAsia="Times New Roman" w:hAnsi="Libertinus Mono" w:cs="Times New Roman"/>
-          <w:b/>
-          <w:bCs/>
-          <w:color w:val="93A1A1"/>
-          <w:sz w:val="21"/>
-          <w:szCs w:val="21"/>
-          <w:lang w:val="es-ES" w:eastAsia="es-ES"/>
-        </w:rPr>
-        <w:t>-&gt;</w:t>
-      </w:r>
+          <w:lang w:eastAsia="es-ES"/>
+        </w:rPr>
+        <w:t>.</w:t>
+      </w:r>
+      <w:r>
+        <w:rPr>
+          <w:rFonts w:ascii="Libertinus Mono" w:eastAsia="Times New Roman" w:hAnsi="Libertinus Mono" w:cs="Times New Roman"/>
+          <w:color w:val="268BD2"/>
+          <w:sz w:val="21"/>
+          <w:szCs w:val="21"/>
+          <w:lang w:eastAsia="es-ES"/>
+        </w:rPr>
+        <w:t>println</w:t>
+      </w:r>
+      <w:proofErr w:type="spellEnd"/>
       <w:r>
         <w:rPr>
           <w:rFonts w:ascii="Libertinus Mono" w:eastAsia="Times New Roman" w:hAnsi="Libertinus Mono" w:cs="Times New Roman"/>
           <w:color w:val="839496"/>
           <w:sz w:val="21"/>
           <w:szCs w:val="21"/>
-          <w:lang w:val="es-ES" w:eastAsia="es-ES"/>
-        </w:rPr>
-        <w:t xml:space="preserve"> </w:t>
-      </w:r>
-      <w:proofErr w:type="spellStart"/>
-      <w:r>
-        <w:rPr>
-          <w:rFonts w:ascii="Libertinus Mono" w:eastAsia="Times New Roman" w:hAnsi="Libertinus Mono" w:cs="Times New Roman"/>
-          <w:color w:val="CB4B16"/>
-          <w:sz w:val="21"/>
-          <w:szCs w:val="21"/>
-          <w:lang w:val="es-ES" w:eastAsia="es-ES"/>
-        </w:rPr>
-        <w:t>System</w:t>
-      </w:r>
-      <w:r>
-        <w:rPr>
-          <w:rFonts w:ascii="Libertinus Mono" w:eastAsia="Times New Roman" w:hAnsi="Libertinus Mono" w:cs="Times New Roman"/>
-          <w:color w:val="839496"/>
-          <w:sz w:val="21"/>
-          <w:szCs w:val="21"/>
-          <w:lang w:val="es-ES" w:eastAsia="es-ES"/>
-        </w:rPr>
-        <w:t>.</w:t>
-      </w:r>
-      <w:r>
-        <w:rPr>
-          <w:rFonts w:ascii="Libertinus Mono" w:eastAsia="Times New Roman" w:hAnsi="Libertinus Mono" w:cs="Times New Roman"/>
-          <w:color w:val="268BD2"/>
-          <w:sz w:val="21"/>
-          <w:szCs w:val="21"/>
-          <w:lang w:val="es-ES" w:eastAsia="es-ES"/>
-        </w:rPr>
-        <w:t>out</w:t>
-      </w:r>
-      <w:r>
-        <w:rPr>
-          <w:rFonts w:ascii="Libertinus Mono" w:eastAsia="Times New Roman" w:hAnsi="Libertinus Mono" w:cs="Times New Roman"/>
-          <w:color w:val="839496"/>
-          <w:sz w:val="21"/>
-          <w:szCs w:val="21"/>
-          <w:lang w:val="es-ES" w:eastAsia="es-ES"/>
-        </w:rPr>
-        <w:t>.</w:t>
-      </w:r>
-      <w:r>
-        <w:rPr>
-          <w:rFonts w:ascii="Libertinus Mono" w:eastAsia="Times New Roman" w:hAnsi="Libertinus Mono" w:cs="Times New Roman"/>
-          <w:color w:val="268BD2"/>
-          <w:sz w:val="21"/>
-          <w:szCs w:val="21"/>
-          <w:lang w:val="es-ES" w:eastAsia="es-ES"/>
-        </w:rPr>
-        <w:t>println</w:t>
-      </w:r>
-      <w:proofErr w:type="spellEnd"/>
-      <w:r>
-        <w:rPr>
-          <w:rFonts w:ascii="Libertinus Mono" w:eastAsia="Times New Roman" w:hAnsi="Libertinus Mono" w:cs="Times New Roman"/>
-          <w:color w:val="839496"/>
-          <w:sz w:val="21"/>
-          <w:szCs w:val="21"/>
-          <w:lang w:val="es-ES" w:eastAsia="es-ES"/>
-        </w:rPr>
-        <w:t>(</w:t>
-      </w:r>
-      <w:proofErr w:type="spellStart"/>
-      <w:r>
-        <w:rPr>
-          <w:rFonts w:ascii="Libertinus Mono" w:eastAsia="Times New Roman" w:hAnsi="Libertinus Mono" w:cs="Times New Roman"/>
-          <w:color w:val="839496"/>
-          <w:sz w:val="21"/>
-          <w:szCs w:val="21"/>
-          <w:lang w:val="es-ES" w:eastAsia="es-ES"/>
-        </w:rPr>
-        <w:t>str</w:t>
-      </w:r>
-      <w:proofErr w:type="spellEnd"/>
-      <w:r>
-        <w:rPr>
-          <w:rFonts w:ascii="Libertinus Mono" w:eastAsia="Times New Roman" w:hAnsi="Libertinus Mono" w:cs="Times New Roman"/>
-          <w:color w:val="839496"/>
-          <w:sz w:val="21"/>
-          <w:szCs w:val="21"/>
-          <w:lang w:val="es-ES" w:eastAsia="es-ES"/>
-        </w:rPr>
-        <w:t>);</w:t>
+          <w:lang w:eastAsia="es-ES"/>
+        </w:rPr>
+        <w:t>(str);</w:t>
       </w:r>
     </w:p>
     <w:p>
@@ -798,7 +1040,7 @@
           <w:color w:val="839496"/>
           <w:sz w:val="21"/>
           <w:szCs w:val="21"/>
-          <w:lang w:val="es-ES" w:eastAsia="es-ES"/>
+          <w:lang w:eastAsia="es-ES"/>
         </w:rPr>
       </w:pPr>
     </w:p>
@@ -807,12 +1049,16 @@
       <w:pPr>
         <w:pStyle w:val="Ttulo3"/>
         <w:spacing w:before="281" w:after="281"/>
-      </w:pPr>
-      <w:r>
-        <w:rPr>
-          <w:rFonts w:ascii="Aptos" w:eastAsia="Aptos" w:hAnsi="Aptos" w:cs="Aptos"/>
-          <w:b/>
-          <w:bCs/>
+        <w:rPr>
+          <w:lang w:val="es-ES"/>
+        </w:rPr>
+      </w:pPr>
+      <w:r>
+        <w:rPr>
+          <w:rFonts w:ascii="Aptos" w:eastAsia="Aptos" w:hAnsi="Aptos" w:cs="Aptos"/>
+          <w:b/>
+          <w:bCs/>
+          <w:lang w:val="es-ES"/>
         </w:rPr>
         <w:t>4</w:t>
       </w:r>
@@ -821,17 +1067,53 @@
           <w:rFonts w:ascii="Aptos" w:eastAsia="Aptos" w:hAnsi="Aptos" w:cs="Aptos"/>
           <w:b/>
           <w:bCs/>
-        </w:rPr>
-        <w:t>. De lambda a method reference</w:t>
-      </w:r>
+          <w:lang w:val="es-ES"/>
+        </w:rPr>
+        <w:t xml:space="preserve">. De lambda a </w:t>
+      </w:r>
+      <w:proofErr w:type="spellStart"/>
+      <w:r>
+        <w:rPr>
+          <w:rFonts w:ascii="Aptos" w:eastAsia="Aptos" w:hAnsi="Aptos" w:cs="Aptos"/>
+          <w:b/>
+          <w:bCs/>
+          <w:lang w:val="es-ES"/>
+        </w:rPr>
+        <w:t>method</w:t>
+      </w:r>
+      <w:proofErr w:type="spellEnd"/>
+      <w:r>
+        <w:rPr>
+          <w:rFonts w:ascii="Aptos" w:eastAsia="Aptos" w:hAnsi="Aptos" w:cs="Aptos"/>
+          <w:b/>
+          <w:bCs/>
+          <w:lang w:val="es-ES"/>
+        </w:rPr>
+        <w:t xml:space="preserve"> </w:t>
+      </w:r>
+      <w:proofErr w:type="spellStart"/>
+      <w:r>
+        <w:rPr>
+          <w:rFonts w:ascii="Aptos" w:eastAsia="Aptos" w:hAnsi="Aptos" w:cs="Aptos"/>
+          <w:b/>
+          <w:bCs/>
+          <w:lang w:val="es-ES"/>
+        </w:rPr>
+        <w:t>reference</w:t>
+      </w:r>
+      <w:proofErr w:type="spellEnd"/>
     </w:p>
     <w:p>
       <w:pPr>
         <w:spacing w:before="240" w:after="240"/>
-      </w:pPr>
-      <w:r>
-        <w:rPr>
-          <w:rFonts w:ascii="Aptos" w:eastAsia="Aptos" w:hAnsi="Aptos" w:cs="Aptos"/>
+        <w:rPr>
+          <w:lang w:val="es-ES"/>
+        </w:rPr>
+      </w:pPr>
+      <w:r>
+        <w:rPr>
+          <w:rFonts w:ascii="Aptos" w:eastAsia="Aptos" w:hAnsi="Aptos" w:cs="Aptos"/>
+          <w:lang w:val="es-ES"/>
         </w:rPr>
         <w:t>Disponemos de:</w:t>
       </w:r>
@@ -841,7 +1123,21 @@
         <w:rPr>
           <w:rFonts w:ascii="Consolas" w:eastAsia="Consolas" w:hAnsi="Consolas" w:cs="Consolas"/>
         </w:rPr>
-        <w:t>public class Calculadora {</w:t>
+        <w:t xml:space="preserve">public class </w:t>
+      </w:r>
+      <w:proofErr w:type="spellStart"/>
+      <w:r>
+        <w:rPr>
+          <w:rFonts w:ascii="Consolas" w:eastAsia="Consolas" w:hAnsi="Consolas" w:cs="Consolas"/>
+        </w:rPr>
+        <w:t>Calculadora</w:t>
+      </w:r>
+      <w:proofErr w:type="spellEnd"/>
+      <w:r>
+        <w:rPr>
+          <w:rFonts w:ascii="Consolas" w:eastAsia="Consolas" w:hAnsi="Consolas" w:cs="Consolas"/>
+        </w:rPr>
+        <w:t xml:space="preserve"> {</w:t>
       </w:r>
       <w:r>
         <w:br/>
@@ -853,7 +1149,21 @@
         <w:rPr>
           <w:rFonts w:ascii="Consolas" w:eastAsia="Consolas" w:hAnsi="Consolas" w:cs="Consolas"/>
         </w:rPr>
-        <w:t xml:space="preserve">    public int sumar(int a, int b) {</w:t>
+        <w:t xml:space="preserve">    public int </w:t>
+      </w:r>
+      <w:proofErr w:type="gramStart"/>
+      <w:r>
+        <w:rPr>
+          <w:rFonts w:ascii="Consolas" w:eastAsia="Consolas" w:hAnsi="Consolas" w:cs="Consolas"/>
+        </w:rPr>
+        <w:t>sumar(</w:t>
+      </w:r>
+      <w:proofErr w:type="gramEnd"/>
+      <w:r>
+        <w:rPr>
+          <w:rFonts w:ascii="Consolas" w:eastAsia="Consolas" w:hAnsi="Consolas" w:cs="Consolas"/>
+        </w:rPr>
+        <w:t>int a, int b) {</w:t>
       </w:r>
       <w:r>
         <w:br/>
@@ -871,8 +1181,16 @@
         <w:rPr>
           <w:rFonts w:ascii="Consolas" w:eastAsia="Consolas" w:hAnsi="Consolas" w:cs="Consolas"/>
         </w:rPr>
-        <w:t xml:space="preserve">    }</w:t>
-      </w:r>
+        <w:t xml:space="preserve">  </w:t>
+      </w:r>
+      <w:proofErr w:type="gramStart"/>
+      <w:r>
+        <w:rPr>
+          <w:rFonts w:ascii="Consolas" w:eastAsia="Consolas" w:hAnsi="Consolas" w:cs="Consolas"/>
+        </w:rPr>
+        <w:t xml:space="preserve">  }</w:t>
+      </w:r>
+      <w:proofErr w:type="gramEnd"/>
       <w:r>
         <w:br/>
       </w:r>
@@ -886,75 +1204,406 @@
     <w:p>
       <w:pPr>
         <w:spacing w:before="240" w:after="240"/>
-      </w:pPr>
-      <w:r>
-        <w:rPr>
-          <w:rFonts w:ascii="Aptos" w:eastAsia="Aptos" w:hAnsi="Aptos" w:cs="Aptos"/>
+        <w:rPr>
+          <w:lang w:val="es-ES"/>
+        </w:rPr>
+      </w:pPr>
+      <w:r>
+        <w:rPr>
+          <w:rFonts w:ascii="Aptos" w:eastAsia="Aptos" w:hAnsi="Aptos" w:cs="Aptos"/>
+          <w:lang w:val="es-ES"/>
         </w:rPr>
         <w:t>Y:</w:t>
       </w:r>
     </w:p>
     <w:p>
-      <w:r>
-        <w:rPr>
-          <w:rFonts w:ascii="Consolas" w:eastAsia="Consolas" w:hAnsi="Consolas" w:cs="Consolas"/>
-        </w:rPr>
-        <w:t>Calculadora calculadora = new Calculadora();</w:t>
-      </w:r>
-      <w:r>
+      <w:pPr>
+        <w:rPr>
+          <w:lang w:val="es-ES"/>
+        </w:rPr>
+      </w:pPr>
+      <w:r>
+        <w:rPr>
+          <w:rFonts w:ascii="Consolas" w:eastAsia="Consolas" w:hAnsi="Consolas" w:cs="Consolas"/>
+          <w:lang w:val="es-ES"/>
+        </w:rPr>
+        <w:lastRenderedPageBreak/>
+        <w:t xml:space="preserve">Calculadora </w:t>
+      </w:r>
+      <w:proofErr w:type="spellStart"/>
+      <w:r>
+        <w:rPr>
+          <w:rFonts w:ascii="Consolas" w:eastAsia="Consolas" w:hAnsi="Consolas" w:cs="Consolas"/>
+          <w:lang w:val="es-ES"/>
+        </w:rPr>
+        <w:t>calculadora</w:t>
+      </w:r>
+      <w:proofErr w:type="spellEnd"/>
+      <w:r>
+        <w:rPr>
+          <w:rFonts w:ascii="Consolas" w:eastAsia="Consolas" w:hAnsi="Consolas" w:cs="Consolas"/>
+          <w:lang w:val="es-ES"/>
+        </w:rPr>
+        <w:t xml:space="preserve"> = new </w:t>
+      </w:r>
+      <w:proofErr w:type="gramStart"/>
+      <w:r>
+        <w:rPr>
+          <w:rFonts w:ascii="Consolas" w:eastAsia="Consolas" w:hAnsi="Consolas" w:cs="Consolas"/>
+          <w:lang w:val="es-ES"/>
+        </w:rPr>
+        <w:t>Calculadora(</w:t>
+      </w:r>
+      <w:proofErr w:type="gramEnd"/>
+      <w:r>
+        <w:rPr>
+          <w:rFonts w:ascii="Consolas" w:eastAsia="Consolas" w:hAnsi="Consolas" w:cs="Consolas"/>
+          <w:lang w:val="es-ES"/>
+        </w:rPr>
+        <w:t>);</w:t>
+      </w:r>
+      <w:r>
+        <w:rPr>
+          <w:lang w:val="es-ES"/>
+        </w:rPr>
         <w:br/>
       </w:r>
       <w:r>
+        <w:rPr>
+          <w:lang w:val="es-ES"/>
+        </w:rPr>
         <w:br/>
       </w:r>
-      <w:r>
-        <w:rPr>
-          <w:rFonts w:ascii="Consolas" w:eastAsia="Consolas" w:hAnsi="Consolas" w:cs="Consolas"/>
-        </w:rPr>
-        <w:lastRenderedPageBreak/>
-        <w:t>Operacion suma =</w:t>
-      </w:r>
-      <w:r>
+      <w:proofErr w:type="spellStart"/>
+      <w:r>
+        <w:rPr>
+          <w:rFonts w:ascii="Consolas" w:eastAsia="Consolas" w:hAnsi="Consolas" w:cs="Consolas"/>
+          <w:lang w:val="es-ES"/>
+        </w:rPr>
+        <w:t>Operacion</w:t>
+      </w:r>
+      <w:proofErr w:type="spellEnd"/>
+      <w:r>
+        <w:rPr>
+          <w:rFonts w:ascii="Consolas" w:eastAsia="Consolas" w:hAnsi="Consolas" w:cs="Consolas"/>
+          <w:lang w:val="es-ES"/>
+        </w:rPr>
+        <w:t xml:space="preserve"> suma =</w:t>
+      </w:r>
+      <w:r>
+        <w:rPr>
+          <w:lang w:val="es-ES"/>
+        </w:rPr>
         <w:br/>
       </w:r>
       <w:r>
         <w:rPr>
           <w:rFonts w:ascii="Consolas" w:eastAsia="Consolas" w:hAnsi="Consolas" w:cs="Consolas"/>
-        </w:rPr>
-        <w:t xml:space="preserve">        (a, b) -&gt; calculadora.sumar(a, b);</w:t>
+          <w:lang w:val="es-ES"/>
+        </w:rPr>
+        <w:t xml:space="preserve">     </w:t>
+      </w:r>
+      <w:proofErr w:type="gramStart"/>
+      <w:r>
+        <w:rPr>
+          <w:rFonts w:ascii="Consolas" w:eastAsia="Consolas" w:hAnsi="Consolas" w:cs="Consolas"/>
+          <w:lang w:val="es-ES"/>
+        </w:rPr>
+        <w:t xml:space="preserve">   (</w:t>
+      </w:r>
+      <w:proofErr w:type="gramEnd"/>
+      <w:r>
+        <w:rPr>
+          <w:rFonts w:ascii="Consolas" w:eastAsia="Consolas" w:hAnsi="Consolas" w:cs="Consolas"/>
+          <w:lang w:val="es-ES"/>
+        </w:rPr>
+        <w:t xml:space="preserve">a, b) -&gt; </w:t>
+      </w:r>
+      <w:proofErr w:type="spellStart"/>
+      <w:proofErr w:type="gramStart"/>
+      <w:r>
+        <w:rPr>
+          <w:rFonts w:ascii="Consolas" w:eastAsia="Consolas" w:hAnsi="Consolas" w:cs="Consolas"/>
+          <w:lang w:val="es-ES"/>
+        </w:rPr>
+        <w:t>calculadora.sumar</w:t>
+      </w:r>
+      <w:proofErr w:type="spellEnd"/>
+      <w:proofErr w:type="gramEnd"/>
+      <w:r>
+        <w:rPr>
+          <w:rFonts w:ascii="Consolas" w:eastAsia="Consolas" w:hAnsi="Consolas" w:cs="Consolas"/>
+          <w:lang w:val="es-ES"/>
+        </w:rPr>
+        <w:t>(a, b);</w:t>
       </w:r>
     </w:p>
     <w:p>
       <w:pPr>
         <w:spacing w:before="240" w:after="240"/>
-      </w:pPr>
-      <w:r>
-        <w:rPr>
-          <w:rFonts w:ascii="Aptos" w:eastAsia="Aptos" w:hAnsi="Aptos" w:cs="Aptos"/>
+        <w:rPr>
+          <w:lang w:val="es-ES"/>
+        </w:rPr>
+      </w:pPr>
+      <w:r>
+        <w:rPr>
+          <w:rFonts w:ascii="Aptos" w:eastAsia="Aptos" w:hAnsi="Aptos" w:cs="Aptos"/>
+          <w:lang w:val="es-ES"/>
         </w:rPr>
         <w:t xml:space="preserve">Convierte la lambda en un </w:t>
       </w:r>
-      <w:r>
-        <w:rPr>
-          <w:rFonts w:ascii="Aptos" w:eastAsia="Aptos" w:hAnsi="Aptos" w:cs="Aptos"/>
-          <w:b/>
-          <w:bCs/>
-        </w:rPr>
-        <w:t>method reference</w:t>
-      </w:r>
-      <w:r>
-        <w:rPr>
-          <w:rFonts w:ascii="Aptos" w:eastAsia="Aptos" w:hAnsi="Aptos" w:cs="Aptos"/>
+      <w:proofErr w:type="spellStart"/>
+      <w:r>
+        <w:rPr>
+          <w:rFonts w:ascii="Aptos" w:eastAsia="Aptos" w:hAnsi="Aptos" w:cs="Aptos"/>
+          <w:b/>
+          <w:bCs/>
+          <w:lang w:val="es-ES"/>
+        </w:rPr>
+        <w:t>method</w:t>
+      </w:r>
+      <w:proofErr w:type="spellEnd"/>
+      <w:r>
+        <w:rPr>
+          <w:rFonts w:ascii="Aptos" w:eastAsia="Aptos" w:hAnsi="Aptos" w:cs="Aptos"/>
+          <w:b/>
+          <w:bCs/>
+          <w:lang w:val="es-ES"/>
+        </w:rPr>
+        <w:t xml:space="preserve"> </w:t>
+      </w:r>
+      <w:proofErr w:type="spellStart"/>
+      <w:r>
+        <w:rPr>
+          <w:rFonts w:ascii="Aptos" w:eastAsia="Aptos" w:hAnsi="Aptos" w:cs="Aptos"/>
+          <w:b/>
+          <w:bCs/>
+          <w:lang w:val="es-ES"/>
+        </w:rPr>
+        <w:t>reference</w:t>
+      </w:r>
+      <w:proofErr w:type="spellEnd"/>
+      <w:r>
+        <w:rPr>
+          <w:rFonts w:ascii="Aptos" w:eastAsia="Aptos" w:hAnsi="Aptos" w:cs="Aptos"/>
+          <w:lang w:val="es-ES"/>
         </w:rPr>
         <w:t>:</w:t>
       </w:r>
     </w:p>
     <w:p>
-      <w:r>
-        <w:rPr>
-          <w:rFonts w:ascii="Consolas" w:eastAsia="Consolas" w:hAnsi="Consolas" w:cs="Consolas"/>
-        </w:rPr>
-        <w:t>Operacion suma =</w:t>
+      <w:pPr>
+        <w:rPr>
+          <w:lang w:val="es-ES"/>
+        </w:rPr>
+      </w:pPr>
+      <w:proofErr w:type="spellStart"/>
+      <w:r>
+        <w:rPr>
+          <w:rFonts w:ascii="Consolas" w:eastAsia="Consolas" w:hAnsi="Consolas" w:cs="Consolas"/>
+          <w:lang w:val="es-ES"/>
+        </w:rPr>
+        <w:t>Operacion</w:t>
+      </w:r>
+      <w:proofErr w:type="spellEnd"/>
+      <w:r>
+        <w:rPr>
+          <w:rFonts w:ascii="Consolas" w:eastAsia="Consolas" w:hAnsi="Consolas" w:cs="Consolas"/>
+          <w:lang w:val="es-ES"/>
+        </w:rPr>
+        <w:t xml:space="preserve"> suma =</w:t>
+      </w:r>
+      <w:r>
+        <w:rPr>
+          <w:lang w:val="es-ES"/>
+        </w:rPr>
+        <w:br/>
+      </w:r>
+      <w:r>
+        <w:rPr>
+          <w:rFonts w:ascii="Consolas" w:eastAsia="Consolas" w:hAnsi="Consolas" w:cs="Consolas"/>
+          <w:lang w:val="es-ES"/>
+        </w:rPr>
+        <w:t xml:space="preserve">        ______________________;</w:t>
+      </w:r>
+    </w:p>
+    <w:p>
+      <w:pPr>
+        <w:rPr>
+          <w:lang w:val="es-ES"/>
+        </w:rPr>
+      </w:pPr>
+    </w:p>
+    <w:p>
+      <w:pPr>
+        <w:pStyle w:val="Ttulo3"/>
+        <w:spacing w:before="281" w:after="281"/>
+        <w:rPr>
+          <w:lang w:val="es-ES"/>
+        </w:rPr>
+      </w:pPr>
+      <w:r>
+        <w:rPr>
+          <w:rFonts w:ascii="Aptos" w:eastAsia="Aptos" w:hAnsi="Aptos" w:cs="Aptos"/>
+          <w:b/>
+          <w:bCs/>
+          <w:lang w:val="es-ES"/>
+        </w:rPr>
+        <w:t>5</w:t>
+      </w:r>
+      <w:r>
+        <w:rPr>
+          <w:rFonts w:ascii="Aptos" w:eastAsia="Aptos" w:hAnsi="Aptos" w:cs="Aptos"/>
+          <w:b/>
+          <w:bCs/>
+          <w:lang w:val="es-ES"/>
+        </w:rPr>
+        <w:t xml:space="preserve">. De </w:t>
+      </w:r>
+      <w:proofErr w:type="spellStart"/>
+      <w:r>
+        <w:rPr>
+          <w:rFonts w:ascii="Aptos" w:eastAsia="Aptos" w:hAnsi="Aptos" w:cs="Aptos"/>
+          <w:b/>
+          <w:bCs/>
+          <w:lang w:val="es-ES"/>
+        </w:rPr>
+        <w:t>method</w:t>
+      </w:r>
+      <w:proofErr w:type="spellEnd"/>
+      <w:r>
+        <w:rPr>
+          <w:rFonts w:ascii="Aptos" w:eastAsia="Aptos" w:hAnsi="Aptos" w:cs="Aptos"/>
+          <w:b/>
+          <w:bCs/>
+          <w:lang w:val="es-ES"/>
+        </w:rPr>
+        <w:t xml:space="preserve"> </w:t>
+      </w:r>
+      <w:proofErr w:type="spellStart"/>
+      <w:r>
+        <w:rPr>
+          <w:rFonts w:ascii="Aptos" w:eastAsia="Aptos" w:hAnsi="Aptos" w:cs="Aptos"/>
+          <w:b/>
+          <w:bCs/>
+          <w:lang w:val="es-ES"/>
+        </w:rPr>
+        <w:t>reference</w:t>
+      </w:r>
+      <w:proofErr w:type="spellEnd"/>
+      <w:r>
+        <w:rPr>
+          <w:rFonts w:ascii="Aptos" w:eastAsia="Aptos" w:hAnsi="Aptos" w:cs="Aptos"/>
+          <w:b/>
+          <w:bCs/>
+          <w:lang w:val="es-ES"/>
+        </w:rPr>
+        <w:t xml:space="preserve"> a lambda</w:t>
+      </w:r>
+    </w:p>
+    <w:p>
+      <w:pPr>
+        <w:spacing w:before="240" w:after="240"/>
+      </w:pPr>
+      <w:proofErr w:type="spellStart"/>
+      <w:r>
+        <w:rPr>
+          <w:rFonts w:ascii="Aptos" w:eastAsia="Aptos" w:hAnsi="Aptos" w:cs="Aptos"/>
+        </w:rPr>
+        <w:t>Tenemos</w:t>
+      </w:r>
+      <w:proofErr w:type="spellEnd"/>
+      <w:r>
+        <w:rPr>
+          <w:rFonts w:ascii="Aptos" w:eastAsia="Aptos" w:hAnsi="Aptos" w:cs="Aptos"/>
+        </w:rPr>
+        <w:t>:</w:t>
+      </w:r>
+    </w:p>
+    <w:p>
+      <w:r>
+        <w:rPr>
+          <w:rFonts w:ascii="Consolas" w:eastAsia="Consolas" w:hAnsi="Consolas" w:cs="Consolas"/>
+        </w:rPr>
+        <w:t>Function&lt;String, Integer&gt; longitud =</w:t>
+      </w:r>
+      <w:r>
+        <w:br/>
+      </w:r>
+      <w:r>
+        <w:rPr>
+          <w:rFonts w:ascii="Consolas" w:eastAsia="Consolas" w:hAnsi="Consolas" w:cs="Consolas"/>
+        </w:rPr>
+        <w:t xml:space="preserve">        String::length;</w:t>
+      </w:r>
+    </w:p>
+    <w:p>
+      <w:pPr>
+        <w:spacing w:before="240" w:after="240"/>
+        <w:rPr>
+          <w:lang w:val="es-ES"/>
+        </w:rPr>
+      </w:pPr>
+      <w:r>
+        <w:rPr>
+          <w:rFonts w:ascii="Aptos" w:eastAsia="Aptos" w:hAnsi="Aptos" w:cs="Aptos"/>
+          <w:lang w:val="es-ES"/>
+        </w:rPr>
+        <w:t xml:space="preserve">Convierte el </w:t>
+      </w:r>
+      <w:proofErr w:type="spellStart"/>
+      <w:r>
+        <w:rPr>
+          <w:rFonts w:ascii="Aptos" w:eastAsia="Aptos" w:hAnsi="Aptos" w:cs="Aptos"/>
+          <w:lang w:val="es-ES"/>
+        </w:rPr>
+        <w:t>method</w:t>
+      </w:r>
+      <w:proofErr w:type="spellEnd"/>
+      <w:r>
+        <w:rPr>
+          <w:rFonts w:ascii="Aptos" w:eastAsia="Aptos" w:hAnsi="Aptos" w:cs="Aptos"/>
+          <w:lang w:val="es-ES"/>
+        </w:rPr>
+        <w:t xml:space="preserve"> </w:t>
+      </w:r>
+      <w:proofErr w:type="spellStart"/>
+      <w:r>
+        <w:rPr>
+          <w:rFonts w:ascii="Aptos" w:eastAsia="Aptos" w:hAnsi="Aptos" w:cs="Aptos"/>
+          <w:lang w:val="es-ES"/>
+        </w:rPr>
+        <w:t>reference</w:t>
+      </w:r>
+      <w:proofErr w:type="spellEnd"/>
+      <w:r>
+        <w:rPr>
+          <w:rFonts w:ascii="Aptos" w:eastAsia="Aptos" w:hAnsi="Aptos" w:cs="Aptos"/>
+          <w:lang w:val="es-ES"/>
+        </w:rPr>
+        <w:t xml:space="preserve"> en una lambda equivalente:</w:t>
+      </w:r>
+    </w:p>
+    <w:p>
+      <w:r>
+        <w:rPr>
+          <w:rFonts w:ascii="Consolas" w:eastAsia="Consolas" w:hAnsi="Consolas" w:cs="Consolas"/>
+        </w:rPr>
+        <w:t xml:space="preserve">Function&lt;String, Integer&gt; </w:t>
+      </w:r>
+      <w:proofErr w:type="spellStart"/>
+      <w:r>
+        <w:rPr>
+          <w:rFonts w:ascii="Consolas" w:eastAsia="Consolas" w:hAnsi="Consolas" w:cs="Consolas"/>
+        </w:rPr>
+        <w:t>longitud</w:t>
+      </w:r>
+      <w:proofErr w:type="spellEnd"/>
+      <w:r>
+        <w:rPr>
+          <w:rFonts w:ascii="Consolas" w:eastAsia="Consolas" w:hAnsi="Consolas" w:cs="Consolas"/>
+        </w:rPr>
+        <w:t xml:space="preserve"> =</w:t>
       </w:r>
       <w:r>
         <w:br/>
@@ -978,305 +1627,777 @@
           <w:b/>
           <w:bCs/>
         </w:rPr>
-        <w:t>5</w:t>
-      </w:r>
-      <w:r>
-        <w:rPr>
-          <w:rFonts w:ascii="Aptos" w:eastAsia="Aptos" w:hAnsi="Aptos" w:cs="Aptos"/>
-          <w:b/>
-          <w:bCs/>
-        </w:rPr>
-        <w:t>. De method reference a lambda</w:t>
+        <w:t>6</w:t>
+      </w:r>
+      <w:r>
+        <w:rPr>
+          <w:rFonts w:ascii="Aptos" w:eastAsia="Aptos" w:hAnsi="Aptos" w:cs="Aptos"/>
+          <w:b/>
+          <w:bCs/>
+        </w:rPr>
+        <w:t>. De lambda a method reference</w:t>
       </w:r>
     </w:p>
     <w:p>
       <w:pPr>
         <w:spacing w:before="240" w:after="240"/>
-      </w:pPr>
-      <w:r>
-        <w:rPr>
-          <w:rFonts w:ascii="Aptos" w:eastAsia="Aptos" w:hAnsi="Aptos" w:cs="Aptos"/>
-        </w:rPr>
-        <w:t>Tenemos:</w:t>
+        <w:rPr>
+          <w:lang w:val="es-ES"/>
+        </w:rPr>
+      </w:pPr>
+      <w:r>
+        <w:rPr>
+          <w:rFonts w:ascii="Aptos" w:eastAsia="Aptos" w:hAnsi="Aptos" w:cs="Aptos"/>
+          <w:lang w:val="es-ES"/>
+        </w:rPr>
+        <w:t>Convierte:</w:t>
       </w:r>
     </w:p>
     <w:p>
-      <w:r>
-        <w:rPr>
-          <w:rFonts w:ascii="Consolas" w:eastAsia="Consolas" w:hAnsi="Consolas" w:cs="Consolas"/>
-        </w:rPr>
-        <w:t>Function&lt;String, Integer&gt; longitud =</w:t>
-      </w:r>
-      <w:r>
+      <w:pPr>
+        <w:rPr>
+          <w:lang w:val="es-ES"/>
+        </w:rPr>
+      </w:pPr>
+      <w:proofErr w:type="spellStart"/>
+      <w:r>
+        <w:rPr>
+          <w:rFonts w:ascii="Consolas" w:eastAsia="Consolas" w:hAnsi="Consolas" w:cs="Consolas"/>
+          <w:lang w:val="es-ES"/>
+        </w:rPr>
+        <w:t>Predicate</w:t>
+      </w:r>
+      <w:proofErr w:type="spellEnd"/>
+      <w:r>
+        <w:rPr>
+          <w:rFonts w:ascii="Consolas" w:eastAsia="Consolas" w:hAnsi="Consolas" w:cs="Consolas"/>
+          <w:lang w:val="es-ES"/>
+        </w:rPr>
+        <w:t xml:space="preserve">&lt;String&gt; </w:t>
+      </w:r>
+      <w:proofErr w:type="spellStart"/>
+      <w:r>
+        <w:rPr>
+          <w:rFonts w:ascii="Consolas" w:eastAsia="Consolas" w:hAnsi="Consolas" w:cs="Consolas"/>
+          <w:lang w:val="es-ES"/>
+        </w:rPr>
+        <w:t>vacio</w:t>
+      </w:r>
+      <w:proofErr w:type="spellEnd"/>
+      <w:r>
+        <w:rPr>
+          <w:rFonts w:ascii="Consolas" w:eastAsia="Consolas" w:hAnsi="Consolas" w:cs="Consolas"/>
+          <w:lang w:val="es-ES"/>
+        </w:rPr>
+        <w:t xml:space="preserve"> =</w:t>
+      </w:r>
+      <w:r>
+        <w:rPr>
+          <w:lang w:val="es-ES"/>
+        </w:rPr>
         <w:br/>
       </w:r>
       <w:r>
         <w:rPr>
           <w:rFonts w:ascii="Consolas" w:eastAsia="Consolas" w:hAnsi="Consolas" w:cs="Consolas"/>
-        </w:rPr>
-        <w:t xml:space="preserve">        String::length;</w:t>
+          <w:lang w:val="es-ES"/>
+        </w:rPr>
+        <w:t xml:space="preserve">        texto -&gt; </w:t>
+      </w:r>
+      <w:proofErr w:type="spellStart"/>
+      <w:proofErr w:type="gramStart"/>
+      <w:r>
+        <w:rPr>
+          <w:rFonts w:ascii="Consolas" w:eastAsia="Consolas" w:hAnsi="Consolas" w:cs="Consolas"/>
+          <w:lang w:val="es-ES"/>
+        </w:rPr>
+        <w:t>texto.isEmpty</w:t>
+      </w:r>
+      <w:proofErr w:type="spellEnd"/>
+      <w:proofErr w:type="gramEnd"/>
+      <w:r>
+        <w:rPr>
+          <w:rFonts w:ascii="Consolas" w:eastAsia="Consolas" w:hAnsi="Consolas" w:cs="Consolas"/>
+          <w:lang w:val="es-ES"/>
+        </w:rPr>
+        <w:t>();</w:t>
       </w:r>
     </w:p>
     <w:p>
       <w:pPr>
         <w:spacing w:before="240" w:after="240"/>
-      </w:pPr>
-      <w:r>
-        <w:rPr>
-          <w:rFonts w:ascii="Aptos" w:eastAsia="Aptos" w:hAnsi="Aptos" w:cs="Aptos"/>
-        </w:rPr>
-        <w:t>Convierte el method reference en una lambda equivalente:</w:t>
+        <w:rPr>
+          <w:lang w:val="es-ES"/>
+        </w:rPr>
+      </w:pPr>
+      <w:r>
+        <w:rPr>
+          <w:rFonts w:ascii="Aptos" w:eastAsia="Aptos" w:hAnsi="Aptos" w:cs="Aptos"/>
+          <w:lang w:val="es-ES"/>
+        </w:rPr>
+        <w:t xml:space="preserve">en un </w:t>
+      </w:r>
+      <w:proofErr w:type="spellStart"/>
+      <w:r>
+        <w:rPr>
+          <w:rFonts w:ascii="Aptos" w:eastAsia="Aptos" w:hAnsi="Aptos" w:cs="Aptos"/>
+          <w:lang w:val="es-ES"/>
+        </w:rPr>
+        <w:t>method</w:t>
+      </w:r>
+      <w:proofErr w:type="spellEnd"/>
+      <w:r>
+        <w:rPr>
+          <w:rFonts w:ascii="Aptos" w:eastAsia="Aptos" w:hAnsi="Aptos" w:cs="Aptos"/>
+          <w:lang w:val="es-ES"/>
+        </w:rPr>
+        <w:t xml:space="preserve"> </w:t>
+      </w:r>
+      <w:proofErr w:type="spellStart"/>
+      <w:r>
+        <w:rPr>
+          <w:rFonts w:ascii="Aptos" w:eastAsia="Aptos" w:hAnsi="Aptos" w:cs="Aptos"/>
+          <w:lang w:val="es-ES"/>
+        </w:rPr>
+        <w:t>reference</w:t>
+      </w:r>
+      <w:proofErr w:type="spellEnd"/>
+      <w:r>
+        <w:rPr>
+          <w:rFonts w:ascii="Aptos" w:eastAsia="Aptos" w:hAnsi="Aptos" w:cs="Aptos"/>
+          <w:lang w:val="es-ES"/>
+        </w:rPr>
+        <w:t>.</w:t>
       </w:r>
     </w:p>
     <w:p>
-      <w:r>
-        <w:rPr>
-          <w:rFonts w:ascii="Consolas" w:eastAsia="Consolas" w:hAnsi="Consolas" w:cs="Consolas"/>
-        </w:rPr>
-        <w:t>Function&lt;String, Integer&gt; longitud =</w:t>
-      </w:r>
-      <w:r>
+      <w:pPr>
+        <w:rPr>
+          <w:lang w:val="es-ES"/>
+        </w:rPr>
+      </w:pPr>
+      <w:proofErr w:type="spellStart"/>
+      <w:r>
+        <w:rPr>
+          <w:rFonts w:ascii="Consolas" w:eastAsia="Consolas" w:hAnsi="Consolas" w:cs="Consolas"/>
+          <w:lang w:val="es-ES"/>
+        </w:rPr>
+        <w:t>Predicate</w:t>
+      </w:r>
+      <w:proofErr w:type="spellEnd"/>
+      <w:r>
+        <w:rPr>
+          <w:rFonts w:ascii="Consolas" w:eastAsia="Consolas" w:hAnsi="Consolas" w:cs="Consolas"/>
+          <w:lang w:val="es-ES"/>
+        </w:rPr>
+        <w:t xml:space="preserve">&lt;String&gt; </w:t>
+      </w:r>
+      <w:proofErr w:type="spellStart"/>
+      <w:r>
+        <w:rPr>
+          <w:rFonts w:ascii="Consolas" w:eastAsia="Consolas" w:hAnsi="Consolas" w:cs="Consolas"/>
+          <w:lang w:val="es-ES"/>
+        </w:rPr>
+        <w:t>vacio</w:t>
+      </w:r>
+      <w:proofErr w:type="spellEnd"/>
+      <w:r>
+        <w:rPr>
+          <w:rFonts w:ascii="Consolas" w:eastAsia="Consolas" w:hAnsi="Consolas" w:cs="Consolas"/>
+          <w:lang w:val="es-ES"/>
+        </w:rPr>
+        <w:t xml:space="preserve"> =</w:t>
+      </w:r>
+      <w:r>
+        <w:rPr>
+          <w:lang w:val="es-ES"/>
+        </w:rPr>
         <w:br/>
       </w:r>
       <w:r>
         <w:rPr>
           <w:rFonts w:ascii="Consolas" w:eastAsia="Consolas" w:hAnsi="Consolas" w:cs="Consolas"/>
-        </w:rPr>
-        <w:t xml:space="preserve">        ______________________;</w:t>
+          <w:lang w:val="es-ES"/>
+        </w:rPr>
+        <w:t xml:space="preserve">        ____</w:t>
+      </w:r>
+      <w:proofErr w:type="gramStart"/>
+      <w:r>
+        <w:rPr>
+          <w:rFonts w:ascii="Consolas" w:eastAsia="Consolas" w:hAnsi="Consolas" w:cs="Consolas"/>
+          <w:lang w:val="es-ES"/>
+        </w:rPr>
+        <w:t>String::</w:t>
+      </w:r>
+      <w:proofErr w:type="spellStart"/>
+      <w:r>
+        <w:rPr>
+          <w:rFonts w:ascii="Consolas" w:eastAsia="Consolas" w:hAnsi="Consolas" w:cs="Consolas"/>
+          <w:lang w:val="es-ES"/>
+        </w:rPr>
+        <w:t>isEmpty</w:t>
+      </w:r>
+      <w:proofErr w:type="spellEnd"/>
+      <w:r>
+        <w:rPr>
+          <w:rFonts w:ascii="Consolas" w:eastAsia="Consolas" w:hAnsi="Consolas" w:cs="Consolas"/>
+          <w:lang w:val="es-ES"/>
+        </w:rPr>
+        <w:t>;_</w:t>
+      </w:r>
+      <w:proofErr w:type="gramEnd"/>
+      <w:r>
+        <w:rPr>
+          <w:rFonts w:ascii="Consolas" w:eastAsia="Consolas" w:hAnsi="Consolas" w:cs="Consolas"/>
+          <w:lang w:val="es-ES"/>
+        </w:rPr>
+        <w:t>___;</w:t>
       </w:r>
     </w:p>
-    <w:p/>
+    <w:p>
+      <w:pPr>
+        <w:rPr>
+          <w:lang w:val="es-ES"/>
+        </w:rPr>
+      </w:pPr>
+    </w:p>
     <w:p>
       <w:pPr>
         <w:pStyle w:val="Ttulo3"/>
         <w:spacing w:before="281" w:after="281"/>
-      </w:pPr>
-      <w:r>
-        <w:rPr>
-          <w:rFonts w:ascii="Aptos" w:eastAsia="Aptos" w:hAnsi="Aptos" w:cs="Aptos"/>
-          <w:b/>
-          <w:bCs/>
-        </w:rPr>
-        <w:t>6</w:t>
-      </w:r>
-      <w:r>
-        <w:rPr>
-          <w:rFonts w:ascii="Aptos" w:eastAsia="Aptos" w:hAnsi="Aptos" w:cs="Aptos"/>
-          <w:b/>
-          <w:bCs/>
-        </w:rPr>
-        <w:t>. De lambda a method reference</w:t>
-      </w:r>
+        <w:rPr>
+          <w:lang w:val="es-ES"/>
+        </w:rPr>
+      </w:pPr>
+      <w:r>
+        <w:rPr>
+          <w:rFonts w:ascii="Aptos" w:eastAsia="Aptos" w:hAnsi="Aptos" w:cs="Aptos"/>
+          <w:b/>
+          <w:bCs/>
+          <w:lang w:val="es-ES"/>
+        </w:rPr>
+        <w:t>7</w:t>
+      </w:r>
+      <w:r>
+        <w:rPr>
+          <w:rFonts w:ascii="Aptos" w:eastAsia="Aptos" w:hAnsi="Aptos" w:cs="Aptos"/>
+          <w:b/>
+          <w:bCs/>
+          <w:lang w:val="es-ES"/>
+        </w:rPr>
+        <w:t xml:space="preserve">. De lambda a </w:t>
+      </w:r>
+      <w:proofErr w:type="spellStart"/>
+      <w:r>
+        <w:rPr>
+          <w:rFonts w:ascii="Aptos" w:eastAsia="Aptos" w:hAnsi="Aptos" w:cs="Aptos"/>
+          <w:b/>
+          <w:bCs/>
+          <w:lang w:val="es-ES"/>
+        </w:rPr>
+        <w:t>method</w:t>
+      </w:r>
+      <w:proofErr w:type="spellEnd"/>
+      <w:r>
+        <w:rPr>
+          <w:rFonts w:ascii="Aptos" w:eastAsia="Aptos" w:hAnsi="Aptos" w:cs="Aptos"/>
+          <w:b/>
+          <w:bCs/>
+          <w:lang w:val="es-ES"/>
+        </w:rPr>
+        <w:t xml:space="preserve"> </w:t>
+      </w:r>
+      <w:proofErr w:type="spellStart"/>
+      <w:r>
+        <w:rPr>
+          <w:rFonts w:ascii="Aptos" w:eastAsia="Aptos" w:hAnsi="Aptos" w:cs="Aptos"/>
+          <w:b/>
+          <w:bCs/>
+          <w:lang w:val="es-ES"/>
+        </w:rPr>
+        <w:t>reference</w:t>
+      </w:r>
+      <w:proofErr w:type="spellEnd"/>
     </w:p>
     <w:p>
       <w:pPr>
         <w:spacing w:before="240" w:after="240"/>
-      </w:pPr>
-      <w:r>
-        <w:rPr>
-          <w:rFonts w:ascii="Aptos" w:eastAsia="Aptos" w:hAnsi="Aptos" w:cs="Aptos"/>
-        </w:rPr>
-        <w:t>Convierte:</w:t>
+        <w:rPr>
+          <w:lang w:val="es-ES"/>
+        </w:rPr>
+      </w:pPr>
+      <w:r>
+        <w:rPr>
+          <w:rFonts w:ascii="Aptos" w:eastAsia="Aptos" w:hAnsi="Aptos" w:cs="Aptos"/>
+          <w:lang w:val="es-ES"/>
+        </w:rPr>
+        <w:t>Tenemos:</w:t>
       </w:r>
     </w:p>
     <w:p>
-      <w:r>
-        <w:rPr>
-          <w:rFonts w:ascii="Consolas" w:eastAsia="Consolas" w:hAnsi="Consolas" w:cs="Consolas"/>
-        </w:rPr>
-        <w:t>Predicate&lt;String&gt; vacio =</w:t>
-      </w:r>
-      <w:r>
+      <w:pPr>
+        <w:rPr>
+          <w:lang w:val="es-ES"/>
+        </w:rPr>
+      </w:pPr>
+      <w:proofErr w:type="spellStart"/>
+      <w:r>
+        <w:rPr>
+          <w:rFonts w:ascii="Consolas" w:eastAsia="Consolas" w:hAnsi="Consolas" w:cs="Consolas"/>
+          <w:lang w:val="es-ES"/>
+        </w:rPr>
+        <w:t>public</w:t>
+      </w:r>
+      <w:proofErr w:type="spellEnd"/>
+      <w:r>
+        <w:rPr>
+          <w:rFonts w:ascii="Consolas" w:eastAsia="Consolas" w:hAnsi="Consolas" w:cs="Consolas"/>
+          <w:lang w:val="es-ES"/>
+        </w:rPr>
+        <w:t xml:space="preserve"> </w:t>
+      </w:r>
+      <w:proofErr w:type="spellStart"/>
+      <w:r>
+        <w:rPr>
+          <w:rFonts w:ascii="Consolas" w:eastAsia="Consolas" w:hAnsi="Consolas" w:cs="Consolas"/>
+          <w:lang w:val="es-ES"/>
+        </w:rPr>
+        <w:t>class</w:t>
+      </w:r>
+      <w:proofErr w:type="spellEnd"/>
+      <w:r>
+        <w:rPr>
+          <w:rFonts w:ascii="Consolas" w:eastAsia="Consolas" w:hAnsi="Consolas" w:cs="Consolas"/>
+          <w:lang w:val="es-ES"/>
+        </w:rPr>
+        <w:t xml:space="preserve"> Utilidades {</w:t>
+      </w:r>
+      <w:r>
+        <w:rPr>
+          <w:lang w:val="es-ES"/>
+        </w:rPr>
         <w:br/>
       </w:r>
       <w:r>
         <w:rPr>
-          <w:rFonts w:ascii="Consolas" w:eastAsia="Consolas" w:hAnsi="Consolas" w:cs="Consolas"/>
-        </w:rPr>
-        <w:t xml:space="preserve">        texto -&gt; texto.isEmpty();</w:t>
+          <w:lang w:val="es-ES"/>
+        </w:rPr>
+        <w:br/>
+      </w:r>
+      <w:r>
+        <w:rPr>
+          <w:rFonts w:ascii="Consolas" w:eastAsia="Consolas" w:hAnsi="Consolas" w:cs="Consolas"/>
+          <w:lang w:val="es-ES"/>
+        </w:rPr>
+        <w:lastRenderedPageBreak/>
+        <w:t xml:space="preserve">    </w:t>
+      </w:r>
+      <w:proofErr w:type="spellStart"/>
+      <w:r>
+        <w:rPr>
+          <w:rFonts w:ascii="Consolas" w:eastAsia="Consolas" w:hAnsi="Consolas" w:cs="Consolas"/>
+          <w:lang w:val="es-ES"/>
+        </w:rPr>
+        <w:t>public</w:t>
+      </w:r>
+      <w:proofErr w:type="spellEnd"/>
+      <w:r>
+        <w:rPr>
+          <w:rFonts w:ascii="Consolas" w:eastAsia="Consolas" w:hAnsi="Consolas" w:cs="Consolas"/>
+          <w:lang w:val="es-ES"/>
+        </w:rPr>
+        <w:t xml:space="preserve"> </w:t>
+      </w:r>
+      <w:proofErr w:type="spellStart"/>
+      <w:r>
+        <w:rPr>
+          <w:rFonts w:ascii="Consolas" w:eastAsia="Consolas" w:hAnsi="Consolas" w:cs="Consolas"/>
+          <w:lang w:val="es-ES"/>
+        </w:rPr>
+        <w:t>static</w:t>
+      </w:r>
+      <w:proofErr w:type="spellEnd"/>
+      <w:r>
+        <w:rPr>
+          <w:rFonts w:ascii="Consolas" w:eastAsia="Consolas" w:hAnsi="Consolas" w:cs="Consolas"/>
+          <w:lang w:val="es-ES"/>
+        </w:rPr>
+        <w:t xml:space="preserve"> </w:t>
+      </w:r>
+      <w:proofErr w:type="spellStart"/>
+      <w:r>
+        <w:rPr>
+          <w:rFonts w:ascii="Consolas" w:eastAsia="Consolas" w:hAnsi="Consolas" w:cs="Consolas"/>
+          <w:lang w:val="es-ES"/>
+        </w:rPr>
+        <w:t>boolean</w:t>
+      </w:r>
+      <w:proofErr w:type="spellEnd"/>
+      <w:r>
+        <w:rPr>
+          <w:rFonts w:ascii="Consolas" w:eastAsia="Consolas" w:hAnsi="Consolas" w:cs="Consolas"/>
+          <w:lang w:val="es-ES"/>
+        </w:rPr>
+        <w:t xml:space="preserve"> </w:t>
+      </w:r>
+      <w:proofErr w:type="spellStart"/>
+      <w:proofErr w:type="gramStart"/>
+      <w:r>
+        <w:rPr>
+          <w:rFonts w:ascii="Consolas" w:eastAsia="Consolas" w:hAnsi="Consolas" w:cs="Consolas"/>
+          <w:lang w:val="es-ES"/>
+        </w:rPr>
+        <w:t>esPar</w:t>
+      </w:r>
+      <w:proofErr w:type="spellEnd"/>
+      <w:r>
+        <w:rPr>
+          <w:rFonts w:ascii="Consolas" w:eastAsia="Consolas" w:hAnsi="Consolas" w:cs="Consolas"/>
+          <w:lang w:val="es-ES"/>
+        </w:rPr>
+        <w:t>(</w:t>
+      </w:r>
+      <w:proofErr w:type="spellStart"/>
+      <w:proofErr w:type="gramEnd"/>
+      <w:r>
+        <w:rPr>
+          <w:rFonts w:ascii="Consolas" w:eastAsia="Consolas" w:hAnsi="Consolas" w:cs="Consolas"/>
+          <w:lang w:val="es-ES"/>
+        </w:rPr>
+        <w:t>int</w:t>
+      </w:r>
+      <w:proofErr w:type="spellEnd"/>
+      <w:r>
+        <w:rPr>
+          <w:rFonts w:ascii="Consolas" w:eastAsia="Consolas" w:hAnsi="Consolas" w:cs="Consolas"/>
+          <w:lang w:val="es-ES"/>
+        </w:rPr>
+        <w:t xml:space="preserve"> </w:t>
+      </w:r>
+      <w:proofErr w:type="spellStart"/>
+      <w:r>
+        <w:rPr>
+          <w:rFonts w:ascii="Consolas" w:eastAsia="Consolas" w:hAnsi="Consolas" w:cs="Consolas"/>
+          <w:lang w:val="es-ES"/>
+        </w:rPr>
+        <w:t>numero</w:t>
+      </w:r>
+      <w:proofErr w:type="spellEnd"/>
+      <w:r>
+        <w:rPr>
+          <w:rFonts w:ascii="Consolas" w:eastAsia="Consolas" w:hAnsi="Consolas" w:cs="Consolas"/>
+          <w:lang w:val="es-ES"/>
+        </w:rPr>
+        <w:t>) {</w:t>
+      </w:r>
+      <w:r>
+        <w:rPr>
+          <w:lang w:val="es-ES"/>
+        </w:rPr>
+        <w:br/>
+      </w:r>
+      <w:r>
+        <w:rPr>
+          <w:rFonts w:ascii="Consolas" w:eastAsia="Consolas" w:hAnsi="Consolas" w:cs="Consolas"/>
+          <w:lang w:val="es-ES"/>
+        </w:rPr>
+        <w:t xml:space="preserve">        </w:t>
+      </w:r>
+      <w:proofErr w:type="spellStart"/>
+      <w:r>
+        <w:rPr>
+          <w:rFonts w:ascii="Consolas" w:eastAsia="Consolas" w:hAnsi="Consolas" w:cs="Consolas"/>
+          <w:lang w:val="es-ES"/>
+        </w:rPr>
+        <w:t>return</w:t>
+      </w:r>
+      <w:proofErr w:type="spellEnd"/>
+      <w:r>
+        <w:rPr>
+          <w:rFonts w:ascii="Consolas" w:eastAsia="Consolas" w:hAnsi="Consolas" w:cs="Consolas"/>
+          <w:lang w:val="es-ES"/>
+        </w:rPr>
+        <w:t xml:space="preserve"> </w:t>
+      </w:r>
+      <w:proofErr w:type="spellStart"/>
+      <w:r>
+        <w:rPr>
+          <w:rFonts w:ascii="Consolas" w:eastAsia="Consolas" w:hAnsi="Consolas" w:cs="Consolas"/>
+          <w:lang w:val="es-ES"/>
+        </w:rPr>
+        <w:t>numero</w:t>
+      </w:r>
+      <w:proofErr w:type="spellEnd"/>
+      <w:r>
+        <w:rPr>
+          <w:rFonts w:ascii="Consolas" w:eastAsia="Consolas" w:hAnsi="Consolas" w:cs="Consolas"/>
+          <w:lang w:val="es-ES"/>
+        </w:rPr>
+        <w:t xml:space="preserve"> % 2 == 0;</w:t>
+      </w:r>
+      <w:r>
+        <w:rPr>
+          <w:lang w:val="es-ES"/>
+        </w:rPr>
+        <w:br/>
+      </w:r>
+      <w:r>
+        <w:rPr>
+          <w:rFonts w:ascii="Consolas" w:eastAsia="Consolas" w:hAnsi="Consolas" w:cs="Consolas"/>
+          <w:lang w:val="es-ES"/>
+        </w:rPr>
+        <w:t xml:space="preserve">  </w:t>
+      </w:r>
+      <w:proofErr w:type="gramStart"/>
+      <w:r>
+        <w:rPr>
+          <w:rFonts w:ascii="Consolas" w:eastAsia="Consolas" w:hAnsi="Consolas" w:cs="Consolas"/>
+          <w:lang w:val="es-ES"/>
+        </w:rPr>
+        <w:t xml:space="preserve">  }</w:t>
+      </w:r>
+      <w:proofErr w:type="gramEnd"/>
+      <w:r>
+        <w:rPr>
+          <w:lang w:val="es-ES"/>
+        </w:rPr>
+        <w:br/>
+      </w:r>
+      <w:r>
+        <w:rPr>
+          <w:rFonts w:ascii="Consolas" w:eastAsia="Consolas" w:hAnsi="Consolas" w:cs="Consolas"/>
+          <w:lang w:val="es-ES"/>
+        </w:rPr>
+        <w:t>}</w:t>
       </w:r>
     </w:p>
     <w:p>
       <w:pPr>
         <w:spacing w:before="240" w:after="240"/>
-      </w:pPr>
-      <w:r>
-        <w:rPr>
-          <w:rFonts w:ascii="Aptos" w:eastAsia="Aptos" w:hAnsi="Aptos" w:cs="Aptos"/>
-        </w:rPr>
-        <w:t>en un method reference.</w:t>
+        <w:rPr>
+          <w:lang w:val="es-ES"/>
+        </w:rPr>
+      </w:pPr>
+      <w:r>
+        <w:rPr>
+          <w:rFonts w:ascii="Aptos" w:eastAsia="Aptos" w:hAnsi="Aptos" w:cs="Aptos"/>
+          <w:lang w:val="es-ES"/>
+        </w:rPr>
+        <w:t>Y:</w:t>
       </w:r>
     </w:p>
     <w:p>
-      <w:r>
-        <w:rPr>
-          <w:rFonts w:ascii="Consolas" w:eastAsia="Consolas" w:hAnsi="Consolas" w:cs="Consolas"/>
-        </w:rPr>
-        <w:t>Predicate&lt;String&gt; vacio =</w:t>
-      </w:r>
-      <w:r>
+      <w:pPr>
+        <w:rPr>
+          <w:lang w:val="es-ES"/>
+        </w:rPr>
+      </w:pPr>
+      <w:proofErr w:type="spellStart"/>
+      <w:r>
+        <w:rPr>
+          <w:rFonts w:ascii="Consolas" w:eastAsia="Consolas" w:hAnsi="Consolas" w:cs="Consolas"/>
+          <w:lang w:val="es-ES"/>
+        </w:rPr>
+        <w:t>Predicate</w:t>
+      </w:r>
+      <w:proofErr w:type="spellEnd"/>
+      <w:r>
+        <w:rPr>
+          <w:rFonts w:ascii="Consolas" w:eastAsia="Consolas" w:hAnsi="Consolas" w:cs="Consolas"/>
+          <w:lang w:val="es-ES"/>
+        </w:rPr>
+        <w:t>&lt;</w:t>
+      </w:r>
+      <w:proofErr w:type="spellStart"/>
+      <w:r>
+        <w:rPr>
+          <w:rFonts w:ascii="Consolas" w:eastAsia="Consolas" w:hAnsi="Consolas" w:cs="Consolas"/>
+          <w:lang w:val="es-ES"/>
+        </w:rPr>
+        <w:t>Integer</w:t>
+      </w:r>
+      <w:proofErr w:type="spellEnd"/>
+      <w:r>
+        <w:rPr>
+          <w:rFonts w:ascii="Consolas" w:eastAsia="Consolas" w:hAnsi="Consolas" w:cs="Consolas"/>
+          <w:lang w:val="es-ES"/>
+        </w:rPr>
+        <w:t>&gt; comprobar =</w:t>
+      </w:r>
+      <w:r>
+        <w:rPr>
+          <w:lang w:val="es-ES"/>
+        </w:rPr>
         <w:br/>
       </w:r>
       <w:r>
         <w:rPr>
           <w:rFonts w:ascii="Consolas" w:eastAsia="Consolas" w:hAnsi="Consolas" w:cs="Consolas"/>
-        </w:rPr>
-        <w:t xml:space="preserve">        ______________________;</w:t>
-      </w:r>
-    </w:p>
-    <w:p/>
-    <w:p>
-      <w:pPr>
-        <w:pStyle w:val="Ttulo3"/>
-        <w:spacing w:before="281" w:after="281"/>
-      </w:pPr>
-      <w:r>
-        <w:rPr>
-          <w:rFonts w:ascii="Aptos" w:eastAsia="Aptos" w:hAnsi="Aptos" w:cs="Aptos"/>
-          <w:b/>
-          <w:bCs/>
-        </w:rPr>
-        <w:t>7</w:t>
-      </w:r>
-      <w:r>
-        <w:rPr>
-          <w:rFonts w:ascii="Aptos" w:eastAsia="Aptos" w:hAnsi="Aptos" w:cs="Aptos"/>
-          <w:b/>
-          <w:bCs/>
-        </w:rPr>
-        <w:t>. De lambda a method reference</w:t>
+          <w:lang w:val="es-ES"/>
+        </w:rPr>
+        <w:t xml:space="preserve">        numero -&gt; </w:t>
+      </w:r>
+      <w:proofErr w:type="spellStart"/>
+      <w:r>
+        <w:rPr>
+          <w:rFonts w:ascii="Consolas" w:eastAsia="Consolas" w:hAnsi="Consolas" w:cs="Consolas"/>
+          <w:lang w:val="es-ES"/>
+        </w:rPr>
+        <w:t>Utilidades.esPar</w:t>
+      </w:r>
+      <w:proofErr w:type="spellEnd"/>
+      <w:r>
+        <w:rPr>
+          <w:rFonts w:ascii="Consolas" w:eastAsia="Consolas" w:hAnsi="Consolas" w:cs="Consolas"/>
+          <w:lang w:val="es-ES"/>
+        </w:rPr>
+        <w:t>(numero);</w:t>
       </w:r>
     </w:p>
     <w:p>
       <w:pPr>
         <w:spacing w:before="240" w:after="240"/>
-      </w:pPr>
-      <w:r>
-        <w:rPr>
-          <w:rFonts w:ascii="Aptos" w:eastAsia="Aptos" w:hAnsi="Aptos" w:cs="Aptos"/>
-        </w:rPr>
-        <w:t>Tenemos:</w:t>
+        <w:rPr>
+          <w:lang w:val="es-ES"/>
+        </w:rPr>
+      </w:pPr>
+      <w:r>
+        <w:rPr>
+          <w:rFonts w:ascii="Aptos" w:eastAsia="Aptos" w:hAnsi="Aptos" w:cs="Aptos"/>
+          <w:lang w:val="es-ES"/>
+        </w:rPr>
+        <w:t xml:space="preserve">Convierte la lambda en un </w:t>
+      </w:r>
+      <w:proofErr w:type="spellStart"/>
+      <w:r>
+        <w:rPr>
+          <w:rFonts w:ascii="Aptos" w:eastAsia="Aptos" w:hAnsi="Aptos" w:cs="Aptos"/>
+          <w:b/>
+          <w:bCs/>
+          <w:lang w:val="es-ES"/>
+        </w:rPr>
+        <w:t>method</w:t>
+      </w:r>
+      <w:proofErr w:type="spellEnd"/>
+      <w:r>
+        <w:rPr>
+          <w:rFonts w:ascii="Aptos" w:eastAsia="Aptos" w:hAnsi="Aptos" w:cs="Aptos"/>
+          <w:b/>
+          <w:bCs/>
+          <w:lang w:val="es-ES"/>
+        </w:rPr>
+        <w:t xml:space="preserve"> </w:t>
+      </w:r>
+      <w:proofErr w:type="spellStart"/>
+      <w:r>
+        <w:rPr>
+          <w:rFonts w:ascii="Aptos" w:eastAsia="Aptos" w:hAnsi="Aptos" w:cs="Aptos"/>
+          <w:b/>
+          <w:bCs/>
+          <w:lang w:val="es-ES"/>
+        </w:rPr>
+        <w:t>reference</w:t>
+      </w:r>
+      <w:proofErr w:type="spellEnd"/>
+      <w:r>
+        <w:rPr>
+          <w:rFonts w:ascii="Aptos" w:eastAsia="Aptos" w:hAnsi="Aptos" w:cs="Aptos"/>
+          <w:lang w:val="es-ES"/>
+        </w:rPr>
+        <w:t>:</w:t>
       </w:r>
     </w:p>
     <w:p>
-      <w:r>
-        <w:rPr>
-          <w:rFonts w:ascii="Consolas" w:eastAsia="Consolas" w:hAnsi="Consolas" w:cs="Consolas"/>
-        </w:rPr>
-        <w:t>public class Utilidades {</w:t>
-      </w:r>
-      <w:r>
+      <w:pPr>
+        <w:rPr>
+          <w:lang w:val="es-ES"/>
+        </w:rPr>
+      </w:pPr>
+      <w:proofErr w:type="spellStart"/>
+      <w:r>
+        <w:rPr>
+          <w:rFonts w:ascii="Consolas" w:eastAsia="Consolas" w:hAnsi="Consolas" w:cs="Consolas"/>
+          <w:lang w:val="es-ES"/>
+        </w:rPr>
+        <w:t>Predicate</w:t>
+      </w:r>
+      <w:proofErr w:type="spellEnd"/>
+      <w:r>
+        <w:rPr>
+          <w:rFonts w:ascii="Consolas" w:eastAsia="Consolas" w:hAnsi="Consolas" w:cs="Consolas"/>
+          <w:lang w:val="es-ES"/>
+        </w:rPr>
+        <w:t>&lt;</w:t>
+      </w:r>
+      <w:proofErr w:type="spellStart"/>
+      <w:r>
+        <w:rPr>
+          <w:rFonts w:ascii="Consolas" w:eastAsia="Consolas" w:hAnsi="Consolas" w:cs="Consolas"/>
+          <w:lang w:val="es-ES"/>
+        </w:rPr>
+        <w:t>Integer</w:t>
+      </w:r>
+      <w:proofErr w:type="spellEnd"/>
+      <w:r>
+        <w:rPr>
+          <w:rFonts w:ascii="Consolas" w:eastAsia="Consolas" w:hAnsi="Consolas" w:cs="Consolas"/>
+          <w:lang w:val="es-ES"/>
+        </w:rPr>
+        <w:t>&gt; comprobar =</w:t>
+      </w:r>
+      <w:r>
+        <w:rPr>
+          <w:lang w:val="es-ES"/>
+        </w:rPr>
         <w:br/>
       </w:r>
       <w:r>
-        <w:br/>
-      </w:r>
-      <w:r>
-        <w:rPr>
-          <w:rFonts w:ascii="Consolas" w:eastAsia="Consolas" w:hAnsi="Consolas" w:cs="Consolas"/>
-        </w:rPr>
-        <w:t xml:space="preserve">    public static boolean esPar(int numero) {</w:t>
-      </w:r>
-      <w:r>
-        <w:br/>
-      </w:r>
-      <w:r>
-        <w:rPr>
-          <w:rFonts w:ascii="Consolas" w:eastAsia="Consolas" w:hAnsi="Consolas" w:cs="Consolas"/>
-        </w:rPr>
-        <w:t xml:space="preserve">        return numero % 2 == 0;</w:t>
-      </w:r>
-      <w:r>
-        <w:br/>
-      </w:r>
-      <w:r>
-        <w:rPr>
-          <w:rFonts w:ascii="Consolas" w:eastAsia="Consolas" w:hAnsi="Consolas" w:cs="Consolas"/>
-        </w:rPr>
-        <w:lastRenderedPageBreak/>
-        <w:t xml:space="preserve">    }</w:t>
-      </w:r>
-      <w:r>
-        <w:br/>
-      </w:r>
-      <w:r>
-        <w:rPr>
-          <w:rFonts w:ascii="Consolas" w:eastAsia="Consolas" w:hAnsi="Consolas" w:cs="Consolas"/>
-        </w:rPr>
-        <w:t>}</w:t>
+        <w:rPr>
+          <w:rFonts w:ascii="Consolas" w:eastAsia="Consolas" w:hAnsi="Consolas" w:cs="Consolas"/>
+          <w:lang w:val="es-ES"/>
+        </w:rPr>
+        <w:t xml:space="preserve">        ____</w:t>
+      </w:r>
+      <w:proofErr w:type="gramStart"/>
+      <w:r>
+        <w:rPr>
+          <w:rFonts w:ascii="Consolas" w:eastAsia="Consolas" w:hAnsi="Consolas" w:cs="Consolas"/>
+          <w:lang w:val="es-ES"/>
+        </w:rPr>
+        <w:t>Utilidades::</w:t>
+      </w:r>
+      <w:proofErr w:type="spellStart"/>
+      <w:r>
+        <w:rPr>
+          <w:rFonts w:ascii="Consolas" w:eastAsia="Consolas" w:hAnsi="Consolas" w:cs="Consolas"/>
+          <w:lang w:val="es-ES"/>
+        </w:rPr>
+        <w:t>esPar</w:t>
+      </w:r>
+      <w:proofErr w:type="spellEnd"/>
+      <w:r>
+        <w:rPr>
+          <w:rFonts w:ascii="Consolas" w:eastAsia="Consolas" w:hAnsi="Consolas" w:cs="Consolas"/>
+          <w:lang w:val="es-ES"/>
+        </w:rPr>
+        <w:t>;</w:t>
+      </w:r>
+      <w:r>
+        <w:rPr>
+          <w:rFonts w:ascii="Consolas" w:eastAsia="Consolas" w:hAnsi="Consolas" w:cs="Consolas"/>
+          <w:lang w:val="es-ES"/>
+        </w:rPr>
+        <w:t>_</w:t>
+      </w:r>
+      <w:proofErr w:type="gramEnd"/>
+      <w:r>
+        <w:rPr>
+          <w:rFonts w:ascii="Consolas" w:eastAsia="Consolas" w:hAnsi="Consolas" w:cs="Consolas"/>
+          <w:lang w:val="es-ES"/>
+        </w:rPr>
+        <w:t>___;</w:t>
       </w:r>
     </w:p>
-    <w:p>
-      <w:pPr>
-        <w:spacing w:before="240" w:after="240"/>
-      </w:pPr>
-      <w:r>
-        <w:rPr>
-          <w:rFonts w:ascii="Aptos" w:eastAsia="Aptos" w:hAnsi="Aptos" w:cs="Aptos"/>
-        </w:rPr>
-        <w:t>Y:</w:t>
-      </w:r>
-    </w:p>
-    <w:p>
-      <w:r>
-        <w:rPr>
-          <w:rFonts w:ascii="Consolas" w:eastAsia="Consolas" w:hAnsi="Consolas" w:cs="Consolas"/>
-        </w:rPr>
-        <w:t>Predicate&lt;Integer&gt; comprobar =</w:t>
-      </w:r>
-      <w:r>
-        <w:br/>
-      </w:r>
-      <w:r>
-        <w:rPr>
-          <w:rFonts w:ascii="Consolas" w:eastAsia="Consolas" w:hAnsi="Consolas" w:cs="Consolas"/>
-        </w:rPr>
-        <w:t xml:space="preserve">        numero -&gt; Utilidades.esPar(numero);</w:t>
-      </w:r>
-    </w:p>
-    <w:p>
-      <w:pPr>
-        <w:spacing w:before="240" w:after="240"/>
-      </w:pPr>
-      <w:r>
-        <w:rPr>
-          <w:rFonts w:ascii="Aptos" w:eastAsia="Aptos" w:hAnsi="Aptos" w:cs="Aptos"/>
-        </w:rPr>
-        <w:t xml:space="preserve">Convierte la lambda en un </w:t>
-      </w:r>
-      <w:r>
-        <w:rPr>
-          <w:rFonts w:ascii="Aptos" w:eastAsia="Aptos" w:hAnsi="Aptos" w:cs="Aptos"/>
-          <w:b/>
-          <w:bCs/>
-        </w:rPr>
-        <w:t>method reference</w:t>
-      </w:r>
-      <w:r>
-        <w:rPr>
-          <w:rFonts w:ascii="Aptos" w:eastAsia="Aptos" w:hAnsi="Aptos" w:cs="Aptos"/>
-        </w:rPr>
-        <w:t>:</w:t>
-      </w:r>
-    </w:p>
-    <w:p>
-      <w:r>
-        <w:rPr>
-          <w:rFonts w:ascii="Consolas" w:eastAsia="Consolas" w:hAnsi="Consolas" w:cs="Consolas"/>
-        </w:rPr>
-        <w:t>Predicate&lt;Integer&gt; comprobar =</w:t>
-      </w:r>
-      <w:r>
-        <w:br/>
-      </w:r>
-      <w:r>
-        <w:rPr>
-          <w:rFonts w:ascii="Consolas" w:eastAsia="Consolas" w:hAnsi="Consolas" w:cs="Consolas"/>
-        </w:rPr>
-        <w:t xml:space="preserve">        ______________________;</w:t>
-      </w:r>
-    </w:p>
-    <w:p/>
     <w:sectPr>
       <w:pgSz w:w="11906" w:h="16838"/>
       <w:pgMar w:top="1440" w:right="1440" w:bottom="1440" w:left="1440" w:header="720" w:footer="720" w:gutter="0"/>
@@ -1288,7 +2409,7 @@
 </file>
 
 <file path=word/numbering.xml><?xml version="1.0" encoding="utf-8"?>
-<w:numbering xmlns:wpc="http://schemas.microsoft.com/office/word/2010/wordprocessingCanvas" xmlns:cx="http://schemas.microsoft.com/office/drawing/2014/chartex" xmlns:mc="http://schemas.openxmlformats.org/markup-compatibility/2006" xmlns:o="urn:schemas-microsoft-com:office:office" xmlns:r="http://schemas.openxmlformats.org/officeDocument/2006/relationships" xmlns:m="http://schemas.openxmlformats.org/officeDocument/2006/math" xmlns:v="urn:schemas-microsoft-com:vml" xmlns:wp14="http://schemas.microsoft.com/office/word/2010/wordprocessingDrawing" xmlns:wp="http://schemas.openxmlformats.org/drawingml/2006/wordprocessingDrawing" xmlns:w10="urn:schemas-microsoft-com:office:word" xmlns:w="http://schemas.openxmlformats.org/wordprocessingml/2006/main" xmlns:w14="http://schemas.microsoft.com/office/word/2010/wordml" xmlns:w15="http://schemas.microsoft.com/office/word/2012/wordml" xmlns:w16se="http://schemas.microsoft.com/office/word/2015/wordml/symex" xmlns:wpg="http://schemas.microsoft.com/office/word/2010/wordprocessingGroup" xmlns:wpi="http://schemas.microsoft.com/office/word/2010/wordprocessingInk" xmlns:wne="http://schemas.microsoft.com/office/word/2006/wordml" xmlns:wps="http://schemas.microsoft.com/office/word/2010/wordprocessingShape" mc:Ignorable="w14 w15 w16se wp14">
+<w:numbering xmlns:wpc="http://schemas.microsoft.com/office/word/2010/wordprocessingCanvas" xmlns:cx="http://schemas.microsoft.com/office/drawing/2014/chartex" xmlns:cx1="http://schemas.microsoft.com/office/drawing/2015/9/8/chartex" xmlns:cx2="http://schemas.microsoft.com/office/drawing/2015/10/21/chartex" xmlns:cx3="http://schemas.microsoft.com/office/drawing/2016/5/9/chartex" xmlns:cx4="http://schemas.microsoft.com/office/drawing/2016/5/10/chartex" xmlns:cx5="http://schemas.microsoft.com/office/drawing/2016/5/11/chartex" xmlns:cx6="http://schemas.microsoft.com/office/drawing/2016/5/12/chartex" xmlns:cx7="http://schemas.microsoft.com/office/drawing/2016/5/13/chartex" xmlns:cx8="http://schemas.microsoft.com/office/drawing/2016/5/14/chartex" xmlns:mc="http://schemas.openxmlformats.org/markup-compatibility/2006" xmlns:aink="http://schemas.microsoft.com/office/drawing/2016/ink" xmlns:am3d="http://schemas.microsoft.com/office/drawing/2017/model3d" xmlns:o="urn:schemas-microsoft-com:office:office" xmlns:oel="http://schemas.microsoft.com/office/2019/extlst" xmlns:r="http://schemas.openxmlformats.org/officeDocument/2006/relationships" xmlns:m="http://schemas.openxmlformats.org/officeDocument/2006/math" xmlns:v="urn:schemas-microsoft-com:vml" xmlns:wp14="http://schemas.microsoft.com/office/word/2010/wordprocessingDrawing" xmlns:wp="http://schemas.openxmlformats.org/drawingml/2006/wordprocessingDrawing" xmlns:w10="urn:schemas-microsoft-com:office:word" xmlns:w="http://schemas.openxmlformats.org/wordprocessingml/2006/main" xmlns:w14="http://schemas.microsoft.com/office/word/2010/wordml" xmlns:w15="http://schemas.microsoft.com/office/word/2012/wordml" xmlns:w16cex="http://schemas.microsoft.com/office/word/2018/wordml/cex" xmlns:w16cid="http://schemas.microsoft.com/office/word/2016/wordml/cid" xmlns:w16="http://schemas.microsoft.com/office/word/2018/wordml" xmlns:w16du="http://schemas.microsoft.com/office/word/2023/wordml/word16du" xmlns:w16sdtdh="http://schemas.microsoft.com/office/word/2020/wordml/sdtdatahash" xmlns:w16sdtfl="http://schemas.microsoft.com/office/word/2024/wordml/sdtformatlock" xmlns:w16se="http://schemas.microsoft.com/office/word/2015/wordml/symex" xmlns:wpg="http://schemas.microsoft.com/office/word/2010/wordprocessingGroup" xmlns:wpi="http://schemas.microsoft.com/office/word/2010/wordprocessingInk" xmlns:wne="http://schemas.microsoft.com/office/word/2006/wordml" xmlns:wps="http://schemas.microsoft.com/office/word/2010/wordprocessingShape" mc:Ignorable="w14 w15 w16se w16cid w16 w16cex w16sdtdh w16sdtfl w16du wp14">
   <w:abstractNum w:abstractNumId="0" w15:restartNumberingAfterBreak="0">
     <w:nsid w:val="0807D291"/>
     <w:multiLevelType w:val="hybridMultilevel"/>
@@ -2149,41 +3270,41 @@
       </w:pPr>
     </w:lvl>
   </w:abstractNum>
-  <w:num w:numId="1">
+  <w:num w:numId="1" w16cid:durableId="865873063">
     <w:abstractNumId w:val="6"/>
   </w:num>
-  <w:num w:numId="2">
+  <w:num w:numId="2" w16cid:durableId="1696269250">
     <w:abstractNumId w:val="2"/>
   </w:num>
-  <w:num w:numId="3">
+  <w:num w:numId="3" w16cid:durableId="47337032">
     <w:abstractNumId w:val="7"/>
   </w:num>
-  <w:num w:numId="4">
+  <w:num w:numId="4" w16cid:durableId="1814517790">
     <w:abstractNumId w:val="0"/>
   </w:num>
-  <w:num w:numId="5">
+  <w:num w:numId="5" w16cid:durableId="1284187907">
     <w:abstractNumId w:val="1"/>
   </w:num>
-  <w:num w:numId="6">
+  <w:num w:numId="6" w16cid:durableId="2145274694">
     <w:abstractNumId w:val="4"/>
   </w:num>
-  <w:num w:numId="7">
+  <w:num w:numId="7" w16cid:durableId="284117487">
     <w:abstractNumId w:val="3"/>
   </w:num>
-  <w:num w:numId="8">
+  <w:num w:numId="8" w16cid:durableId="536354125">
     <w:abstractNumId w:val="5"/>
   </w:num>
-  <w:num w:numId="9">
+  <w:num w:numId="9" w16cid:durableId="834607092">
     <w:abstractNumId w:val="9"/>
   </w:num>
-  <w:num w:numId="10">
+  <w:num w:numId="10" w16cid:durableId="295262129">
     <w:abstractNumId w:val="8"/>
   </w:num>
 </w:numbering>
 </file>
 
 <file path=word/styles.xml><?xml version="1.0" encoding="utf-8"?>
-<w:styles xmlns:mc="http://schemas.openxmlformats.org/markup-compatibility/2006" xmlns:r="http://schemas.openxmlformats.org/officeDocument/2006/relationships" xmlns:w="http://schemas.openxmlformats.org/wordprocessingml/2006/main" xmlns:w14="http://schemas.microsoft.com/office/word/2010/wordml" xmlns:w15="http://schemas.microsoft.com/office/word/2012/wordml" xmlns:w16se="http://schemas.microsoft.com/office/word/2015/wordml/symex" mc:Ignorable="w14 w15 w16se">
+<w:styles xmlns:mc="http://schemas.openxmlformats.org/markup-compatibility/2006" xmlns:r="http://schemas.openxmlformats.org/officeDocument/2006/relationships" xmlns:w="http://schemas.openxmlformats.org/wordprocessingml/2006/main" xmlns:w14="http://schemas.microsoft.com/office/word/2010/wordml" xmlns:w15="http://schemas.microsoft.com/office/word/2012/wordml" xmlns:w16cex="http://schemas.microsoft.com/office/word/2018/wordml/cex" xmlns:w16cid="http://schemas.microsoft.com/office/word/2016/wordml/cid" xmlns:w16="http://schemas.microsoft.com/office/word/2018/wordml" xmlns:w16du="http://schemas.microsoft.com/office/word/2023/wordml/word16du" xmlns:w16sdtdh="http://schemas.microsoft.com/office/word/2020/wordml/sdtdatahash" xmlns:w16sdtfl="http://schemas.microsoft.com/office/word/2024/wordml/sdtformatlock" xmlns:w16se="http://schemas.microsoft.com/office/word/2015/wordml/symex" mc:Ignorable="w14 w15 w16se w16cid w16 w16cex w16sdtdh w16sdtfl w16du">
   <w:docDefaults>
     <w:rPrDefault>
       <w:rPr>
@@ -2199,7 +3320,7 @@
       </w:pPr>
     </w:pPrDefault>
   </w:docDefaults>
-  <w:latentStyles w:defLockedState="0" w:defUIPriority="99" w:defSemiHidden="0" w:defUnhideWhenUsed="0" w:defQFormat="0" w:count="371">
+  <w:latentStyles w:defLockedState="0" w:defUIPriority="99" w:defSemiHidden="0" w:defUnhideWhenUsed="0" w:defQFormat="0" w:count="376">
     <w:lsdException w:name="Normal" w:uiPriority="0" w:qFormat="1"/>
     <w:lsdException w:name="heading 1" w:uiPriority="9" w:qFormat="1"/>
     <w:lsdException w:name="heading 2" w:semiHidden="1" w:uiPriority="9" w:unhideWhenUsed="1" w:qFormat="1"/>
@@ -2571,6 +3692,11 @@
     <w:lsdException w:name="List Table 5 Dark Accent 6" w:uiPriority="50"/>
     <w:lsdException w:name="List Table 6 Colorful Accent 6" w:uiPriority="51"/>
     <w:lsdException w:name="List Table 7 Colorful Accent 6" w:uiPriority="52"/>
+    <w:lsdException w:name="Mention" w:semiHidden="1" w:unhideWhenUsed="1"/>
+    <w:lsdException w:name="Smart Hyperlink" w:semiHidden="1" w:unhideWhenUsed="1"/>
+    <w:lsdException w:name="Hashtag" w:semiHidden="1" w:unhideWhenUsed="1"/>
+    <w:lsdException w:name="Unresolved Mention" w:semiHidden="1" w:unhideWhenUsed="1"/>
+    <w:lsdException w:name="Smart Link" w:semiHidden="1" w:unhideWhenUsed="1"/>
   </w:latentStyles>
   <w:style w:type="paragraph" w:default="1" w:styleId="Normal">
     <w:name w:val="Normal"/>

</xml_diff>